<commit_message>
maj DP FE et BE avec cinema
</commit_message>
<xml_diff>
--- a/admin/DP_Laury_RENAU.docx
+++ b/admin/DP_Laury_RENAU.docx
@@ -2306,21 +2306,23 @@
                 <w:rFonts w:cstheme="minorHAnsi"/>
                 <w:color w:val="404040" w:themeColor="text1" w:themeTint="BF"/>
               </w:rPr>
-              <w:t>Intitulé</w:t>
-            </w:r>
-            <w:r>
-              <w:rPr>
-                <w:rFonts w:cstheme="minorHAnsi"/>
-                <w:color w:val="404040" w:themeColor="text1" w:themeTint="BF"/>
-              </w:rPr>
-              <w:t xml:space="preserve"> de l’exemple</w:t>
-            </w:r>
-            <w:r>
-              <w:rPr>
-                <w:rFonts w:cstheme="minorHAnsi"/>
-                <w:color w:val="404040" w:themeColor="text1" w:themeTint="BF"/>
-              </w:rPr>
-              <w:t xml:space="preserve"> n° 1 </w:t>
+              <w:t xml:space="preserve">Exercice de formation </w:t>
+            </w:r>
+            <w:r>
+              <w:rPr>
+                <w:rFonts w:cstheme="minorHAnsi"/>
+                <w:b/>
+                <w:bCs/>
+                <w:color w:val="404040" w:themeColor="text1" w:themeTint="BF"/>
+              </w:rPr>
+              <w:t>« Cinema »</w:t>
+            </w:r>
+            <w:r>
+              <w:rPr>
+                <w:rFonts w:cstheme="minorHAnsi"/>
+                <w:color w:val="404040" w:themeColor="text1" w:themeTint="BF"/>
+              </w:rPr>
+              <w:t> </w:t>
             </w:r>
             <w:r>
               <w:rPr>
@@ -2384,6 +2386,13 @@
                 <w:color w:val="404040" w:themeColor="text1" w:themeTint="BF"/>
               </w:rPr>
             </w:pPr>
+            <w:r>
+              <w:rPr>
+                <w:rFonts w:cstheme="minorHAnsi"/>
+                <w:color w:val="404040" w:themeColor="text1" w:themeTint="BF"/>
+              </w:rPr>
+              <w:t>5</w:t>
+            </w:r>
           </w:p>
         </w:tc>
       </w:tr>
@@ -2507,6 +2516,13 @@
                 <w:color w:val="404040" w:themeColor="text1" w:themeTint="BF"/>
               </w:rPr>
             </w:pPr>
+            <w:r>
+              <w:rPr>
+                <w:rFonts w:cstheme="minorHAnsi"/>
+                <w:color w:val="404040" w:themeColor="text1" w:themeTint="BF"/>
+              </w:rPr>
+              <w:t>8</w:t>
+            </w:r>
           </w:p>
         </w:tc>
       </w:tr>
@@ -2644,6 +2660,13 @@
                 <w:color w:val="404040" w:themeColor="text1" w:themeTint="BF"/>
               </w:rPr>
             </w:pPr>
+            <w:r>
+              <w:rPr>
+                <w:rFonts w:cstheme="minorHAnsi"/>
+                <w:color w:val="404040" w:themeColor="text1" w:themeTint="BF"/>
+              </w:rPr>
+              <w:t>10</w:t>
+            </w:r>
           </w:p>
         </w:tc>
       </w:tr>
@@ -2875,21 +2898,23 @@
                 <w:rFonts w:cstheme="minorHAnsi"/>
                 <w:color w:val="404040" w:themeColor="text1" w:themeTint="BF"/>
               </w:rPr>
-              <w:t>Intitulé de l’exemple</w:t>
-            </w:r>
-            <w:r>
-              <w:rPr>
-                <w:rFonts w:cstheme="minorHAnsi"/>
-                <w:color w:val="404040" w:themeColor="text1" w:themeTint="BF"/>
-              </w:rPr>
-              <w:t xml:space="preserve"> n° 1 </w:t>
-            </w:r>
-            <w:r>
-              <w:rPr>
-                <w:rFonts w:cstheme="minorHAnsi"/>
-                <w:color w:val="404040" w:themeColor="text1" w:themeTint="BF"/>
-              </w:rPr>
-              <w:t xml:space="preserve"> </w:t>
+              <w:t xml:space="preserve">Exercice de formation </w:t>
+            </w:r>
+            <w:r>
+              <w:rPr>
+                <w:rFonts w:cstheme="minorHAnsi"/>
+                <w:b/>
+                <w:bCs/>
+                <w:color w:val="404040" w:themeColor="text1" w:themeTint="BF"/>
+              </w:rPr>
+              <w:t>« Cinema »</w:t>
+            </w:r>
+            <w:r>
+              <w:rPr>
+                <w:rFonts w:cstheme="minorHAnsi"/>
+                <w:color w:val="404040" w:themeColor="text1" w:themeTint="BF"/>
+              </w:rPr>
+              <w:t> </w:t>
             </w:r>
             <w:r>
               <w:rPr>
@@ -2946,6 +2971,13 @@
                 <w:color w:val="404040" w:themeColor="text1" w:themeTint="BF"/>
               </w:rPr>
             </w:pPr>
+            <w:r>
+              <w:rPr>
+                <w:rFonts w:cstheme="minorHAnsi"/>
+                <w:color w:val="404040" w:themeColor="text1" w:themeTint="BF"/>
+              </w:rPr>
+              <w:t>13</w:t>
+            </w:r>
           </w:p>
         </w:tc>
       </w:tr>
@@ -3076,6 +3108,13 @@
                 <w:color w:val="404040" w:themeColor="text1" w:themeTint="BF"/>
               </w:rPr>
             </w:pPr>
+            <w:r>
+              <w:rPr>
+                <w:rFonts w:cstheme="minorHAnsi"/>
+                <w:color w:val="404040" w:themeColor="text1" w:themeTint="BF"/>
+              </w:rPr>
+              <w:t>16</w:t>
+            </w:r>
           </w:p>
         </w:tc>
       </w:tr>
@@ -3213,6 +3252,13 @@
                 <w:color w:val="404040" w:themeColor="text1" w:themeTint="BF"/>
               </w:rPr>
             </w:pPr>
+            <w:r>
+              <w:rPr>
+                <w:rFonts w:cstheme="minorHAnsi"/>
+                <w:color w:val="404040" w:themeColor="text1" w:themeTint="BF"/>
+              </w:rPr>
+              <w:t>18</w:t>
+            </w:r>
           </w:p>
         </w:tc>
       </w:tr>
@@ -4433,7 +4479,6 @@
             <w:placeholder>
               <w:docPart w:val="091AF24CA30F4EA4B9F47BD97851B2FA"/>
             </w:placeholder>
-            <w:showingPlcHdr/>
           </w:sdtPr>
           <w:sdtEndPr/>
           <w:sdtContent>
@@ -4457,35 +4502,12 @@
                 </w:pPr>
                 <w:r>
                   <w:rPr>
-                    <w:rStyle w:val="Textedelespacerserv"/>
+                    <w:rFonts w:cstheme="minorHAnsi"/>
+                    <w:b/>
                     <w:i/>
-                    <w:color w:val="404040" w:themeColor="text1" w:themeTint="BF"/>
+                    <w:color w:val="7F7F7F" w:themeColor="text1" w:themeTint="80"/>
                   </w:rPr>
-                  <w:t>Cliquez</w:t>
-                </w:r>
-                <w:r>
-                  <w:rPr>
-                    <w:rStyle w:val="Textedelespacerserv"/>
-                    <w:i/>
-                    <w:color w:val="404040" w:themeColor="text1" w:themeTint="BF"/>
-                  </w:rPr>
-                  <w:t xml:space="preserve"> ici</w:t>
-                </w:r>
-                <w:r>
-                  <w:rPr>
-                    <w:rStyle w:val="Textedelespacerserv"/>
-                    <w:i/>
-                    <w:color w:val="404040" w:themeColor="text1" w:themeTint="BF"/>
-                  </w:rPr>
-                  <w:t xml:space="preserve"> pour entrer</w:t>
-                </w:r>
-                <w:r>
-                  <w:rPr>
-                    <w:rStyle w:val="Textedelespacerserv"/>
-                    <w:i/>
-                    <w:color w:val="404040" w:themeColor="text1" w:themeTint="BF"/>
-                  </w:rPr>
-                  <w:t xml:space="preserve"> l’intitulé de l’exemple</w:t>
+                  <w:t>Exercice Cinema</w:t>
                 </w:r>
               </w:p>
             </w:tc>
@@ -4579,11 +4601,6 @@
         </w:trPr>
         <w:sdt>
           <w:sdtPr>
-            <w:rPr>
-              <w:rFonts w:cstheme="minorHAnsi"/>
-              <w:b/>
-              <w:color w:val="404040" w:themeColor="text1" w:themeTint="BF"/>
-            </w:rPr>
             <w:alias w:val="1.Décrire tâches effectuées"/>
             <w:tag w:val="1.Décrire tâches effectuées"/>
             <w:id w:val="-385645656"/>
@@ -4606,6 +4623,404 @@
               </w:tcPr>
               <w:p>
                 <w:pPr>
+                  <w:pStyle w:val="Paragraphedeliste"/>
+                  <w:numPr>
+                    <w:ilvl w:val="0"/>
+                    <w:numId w:val="17"/>
+                  </w:numPr>
+                  <w:spacing w:before="100" w:beforeAutospacing="1" w:after="100" w:afterAutospacing="1"/>
+                  <w:rPr>
+                    <w:rFonts w:ascii="Times New Roman" w:eastAsia="Times New Roman" w:hAnsi="Times New Roman" w:cs="Times New Roman"/>
+                    <w:sz w:val="24"/>
+                    <w:szCs w:val="24"/>
+                    <w:lang w:eastAsia="fr-FR"/>
+                  </w:rPr>
+                </w:pPr>
+                <w:r>
+                  <w:rPr>
+                    <w:rFonts w:ascii="Times New Roman" w:eastAsia="Times New Roman" w:hAnsi="Times New Roman" w:cs="Times New Roman"/>
+                    <w:b/>
+                    <w:bCs/>
+                    <w:sz w:val="24"/>
+                    <w:szCs w:val="24"/>
+                    <w:lang w:eastAsia="fr-FR"/>
+                  </w:rPr>
+                  <w:t>Conception</w:t>
+                </w:r>
+              </w:p>
+              <w:p>
+                <w:pPr>
+                  <w:pStyle w:val="Paragraphedeliste"/>
+                  <w:numPr>
+                    <w:ilvl w:val="0"/>
+                    <w:numId w:val="16"/>
+                  </w:numPr>
+                  <w:spacing w:before="100" w:beforeAutospacing="1" w:after="100" w:afterAutospacing="1"/>
+                  <w:rPr>
+                    <w:rFonts w:ascii="Times New Roman" w:eastAsia="Times New Roman" w:hAnsi="Times New Roman" w:cs="Times New Roman"/>
+                    <w:sz w:val="24"/>
+                    <w:szCs w:val="24"/>
+                    <w:lang w:eastAsia="fr-FR"/>
+                  </w:rPr>
+                </w:pPr>
+                <w:r>
+                  <w:rPr>
+                    <w:rFonts w:ascii="Times New Roman" w:eastAsia="Times New Roman" w:hAnsi="Times New Roman" w:cs="Times New Roman"/>
+                    <w:sz w:val="24"/>
+                    <w:szCs w:val="24"/>
+                    <w:lang w:eastAsia="fr-FR"/>
+                  </w:rPr>
+                  <w:t>Utilisation du Création d'une maquette (mock-up) pour visualiser l'interface utilisateur.</w:t>
+                </w:r>
+              </w:p>
+              <w:p>
+                <w:pPr>
+                  <w:pStyle w:val="Paragraphedeliste"/>
+                  <w:spacing w:before="100" w:beforeAutospacing="1" w:after="100" w:afterAutospacing="1"/>
+                  <w:ind w:left="1080"/>
+                  <w:rPr>
+                    <w:rFonts w:ascii="Times New Roman" w:eastAsia="Times New Roman" w:hAnsi="Times New Roman" w:cs="Times New Roman"/>
+                    <w:sz w:val="24"/>
+                    <w:szCs w:val="24"/>
+                    <w:lang w:eastAsia="fr-FR"/>
+                  </w:rPr>
+                </w:pPr>
+              </w:p>
+              <w:p>
+                <w:pPr>
+                  <w:pStyle w:val="Paragraphedeliste"/>
+                  <w:numPr>
+                    <w:ilvl w:val="0"/>
+                    <w:numId w:val="17"/>
+                  </w:numPr>
+                  <w:spacing w:before="100" w:beforeAutospacing="1" w:after="100" w:afterAutospacing="1"/>
+                  <w:rPr>
+                    <w:rFonts w:ascii="Times New Roman" w:eastAsia="Times New Roman" w:hAnsi="Times New Roman" w:cs="Times New Roman"/>
+                    <w:sz w:val="24"/>
+                    <w:szCs w:val="24"/>
+                    <w:lang w:eastAsia="fr-FR"/>
+                  </w:rPr>
+                </w:pPr>
+                <w:r>
+                  <w:rPr>
+                    <w:rFonts w:ascii="Times New Roman" w:eastAsia="Times New Roman" w:hAnsi="Times New Roman" w:cs="Times New Roman"/>
+                    <w:b/>
+                    <w:bCs/>
+                    <w:sz w:val="24"/>
+                    <w:szCs w:val="24"/>
+                    <w:lang w:eastAsia="fr-FR"/>
+                  </w:rPr>
+                  <w:t>Développement et structure</w:t>
+                </w:r>
+              </w:p>
+              <w:p>
+                <w:pPr>
+                  <w:pStyle w:val="Paragraphedeliste"/>
+                  <w:numPr>
+                    <w:ilvl w:val="0"/>
+                    <w:numId w:val="14"/>
+                  </w:numPr>
+                  <w:spacing w:before="100" w:beforeAutospacing="1" w:after="100" w:afterAutospacing="1"/>
+                  <w:rPr>
+                    <w:rFonts w:ascii="Times New Roman" w:eastAsia="Times New Roman" w:hAnsi="Times New Roman" w:cs="Times New Roman"/>
+                    <w:sz w:val="24"/>
+                    <w:szCs w:val="24"/>
+                    <w:lang w:eastAsia="fr-FR"/>
+                  </w:rPr>
+                </w:pPr>
+                <w:r>
+                  <w:rPr>
+                    <w:rFonts w:ascii="Times New Roman" w:eastAsia="Times New Roman" w:hAnsi="Times New Roman" w:cs="Times New Roman"/>
+                    <w:sz w:val="24"/>
+                    <w:szCs w:val="24"/>
+                    <w:lang w:eastAsia="fr-FR"/>
+                  </w:rPr>
+                  <w:t xml:space="preserve">Utilisation du modèle </w:t>
+                </w:r>
+                <w:r>
+                  <w:rPr>
+                    <w:rFonts w:ascii="Times New Roman" w:eastAsia="Times New Roman" w:hAnsi="Times New Roman" w:cs="Times New Roman"/>
+                    <w:i/>
+                    <w:iCs/>
+                    <w:sz w:val="24"/>
+                    <w:szCs w:val="24"/>
+                    <w:lang w:eastAsia="fr-FR"/>
+                  </w:rPr>
+                  <w:t>MVC</w:t>
+                </w:r>
+                <w:r>
+                  <w:rPr>
+                    <w:rFonts w:ascii="Times New Roman" w:eastAsia="Times New Roman" w:hAnsi="Times New Roman" w:cs="Times New Roman"/>
+                    <w:sz w:val="24"/>
+                    <w:szCs w:val="24"/>
+                    <w:lang w:eastAsia="fr-FR"/>
+                  </w:rPr>
+                  <w:t xml:space="preserve"> (Model-View-Controller) pour organiser le projet.</w:t>
+                </w:r>
+              </w:p>
+              <w:p>
+                <w:pPr>
+                  <w:pStyle w:val="Paragraphedeliste"/>
+                  <w:numPr>
+                    <w:ilvl w:val="0"/>
+                    <w:numId w:val="14"/>
+                  </w:numPr>
+                  <w:spacing w:before="100" w:beforeAutospacing="1" w:after="100" w:afterAutospacing="1"/>
+                  <w:rPr>
+                    <w:rFonts w:ascii="Times New Roman" w:eastAsia="Times New Roman" w:hAnsi="Times New Roman" w:cs="Times New Roman"/>
+                    <w:sz w:val="24"/>
+                    <w:szCs w:val="24"/>
+                    <w:lang w:eastAsia="fr-FR"/>
+                  </w:rPr>
+                </w:pPr>
+                <w:r>
+                  <w:rPr>
+                    <w:rFonts w:ascii="Times New Roman" w:eastAsia="Times New Roman" w:hAnsi="Times New Roman" w:cs="Times New Roman"/>
+                    <w:sz w:val="24"/>
+                    <w:szCs w:val="24"/>
+                    <w:lang w:eastAsia="fr-FR"/>
+                  </w:rPr>
+                  <w:t xml:space="preserve">Conception des pages avec </w:t>
+                </w:r>
+                <w:r>
+                  <w:rPr>
+                    <w:rFonts w:ascii="Times New Roman" w:eastAsia="Times New Roman" w:hAnsi="Times New Roman" w:cs="Times New Roman"/>
+                    <w:i/>
+                    <w:iCs/>
+                    <w:sz w:val="24"/>
+                    <w:szCs w:val="24"/>
+                    <w:lang w:eastAsia="fr-FR"/>
+                  </w:rPr>
+                  <w:t>HTML</w:t>
+                </w:r>
+                <w:r>
+                  <w:rPr>
+                    <w:rFonts w:ascii="Times New Roman" w:eastAsia="Times New Roman" w:hAnsi="Times New Roman" w:cs="Times New Roman"/>
+                    <w:sz w:val="24"/>
+                    <w:szCs w:val="24"/>
+                    <w:lang w:eastAsia="fr-FR"/>
+                  </w:rPr>
+                  <w:t xml:space="preserve"> pour la structure.</w:t>
+                </w:r>
+              </w:p>
+              <w:p>
+                <w:pPr>
+                  <w:pStyle w:val="Paragraphedeliste"/>
+                  <w:spacing w:before="100" w:beforeAutospacing="1" w:after="100" w:afterAutospacing="1"/>
+                  <w:ind w:left="1080"/>
+                  <w:rPr>
+                    <w:rFonts w:ascii="Times New Roman" w:eastAsia="Times New Roman" w:hAnsi="Times New Roman" w:cs="Times New Roman"/>
+                    <w:sz w:val="24"/>
+                    <w:szCs w:val="24"/>
+                    <w:lang w:eastAsia="fr-FR"/>
+                  </w:rPr>
+                </w:pPr>
+              </w:p>
+              <w:p>
+                <w:pPr>
+                  <w:pStyle w:val="Paragraphedeliste"/>
+                  <w:numPr>
+                    <w:ilvl w:val="0"/>
+                    <w:numId w:val="17"/>
+                  </w:numPr>
+                  <w:spacing w:before="100" w:beforeAutospacing="1" w:after="100" w:afterAutospacing="1"/>
+                  <w:rPr>
+                    <w:rFonts w:ascii="Times New Roman" w:eastAsia="Times New Roman" w:hAnsi="Times New Roman" w:cs="Times New Roman"/>
+                    <w:sz w:val="24"/>
+                    <w:szCs w:val="24"/>
+                    <w:lang w:eastAsia="fr-FR"/>
+                  </w:rPr>
+                </w:pPr>
+                <w:r>
+                  <w:rPr>
+                    <w:rFonts w:ascii="Times New Roman" w:eastAsia="Times New Roman" w:hAnsi="Times New Roman" w:cs="Times New Roman"/>
+                    <w:b/>
+                    <w:bCs/>
+                    <w:sz w:val="24"/>
+                    <w:szCs w:val="24"/>
+                    <w:lang w:eastAsia="fr-FR"/>
+                  </w:rPr>
+                  <w:t>Présentation et style</w:t>
+                </w:r>
+              </w:p>
+              <w:p>
+                <w:pPr>
+                  <w:pStyle w:val="Paragraphedeliste"/>
+                  <w:numPr>
+                    <w:ilvl w:val="0"/>
+                    <w:numId w:val="14"/>
+                  </w:numPr>
+                  <w:spacing w:before="100" w:beforeAutospacing="1" w:after="100" w:afterAutospacing="1"/>
+                  <w:rPr>
+                    <w:rFonts w:ascii="Times New Roman" w:eastAsia="Times New Roman" w:hAnsi="Times New Roman" w:cs="Times New Roman"/>
+                    <w:sz w:val="24"/>
+                    <w:szCs w:val="24"/>
+                    <w:lang w:eastAsia="fr-FR"/>
+                  </w:rPr>
+                </w:pPr>
+                <w:r>
+                  <w:rPr>
+                    <w:rFonts w:ascii="Times New Roman" w:eastAsia="Times New Roman" w:hAnsi="Times New Roman" w:cs="Times New Roman"/>
+                    <w:sz w:val="24"/>
+                    <w:szCs w:val="24"/>
+                    <w:lang w:eastAsia="fr-FR"/>
+                  </w:rPr>
+                  <w:t>Harmonisation de l'apparence grâce à des templates.</w:t>
+                </w:r>
+              </w:p>
+              <w:p>
+                <w:pPr>
+                  <w:pStyle w:val="Paragraphedeliste"/>
+                  <w:numPr>
+                    <w:ilvl w:val="0"/>
+                    <w:numId w:val="14"/>
+                  </w:numPr>
+                  <w:spacing w:before="100" w:beforeAutospacing="1" w:after="100" w:afterAutospacing="1"/>
+                  <w:rPr>
+                    <w:rFonts w:ascii="Times New Roman" w:eastAsia="Times New Roman" w:hAnsi="Times New Roman" w:cs="Times New Roman"/>
+                    <w:sz w:val="24"/>
+                    <w:szCs w:val="24"/>
+                    <w:lang w:eastAsia="fr-FR"/>
+                  </w:rPr>
+                </w:pPr>
+                <w:r>
+                  <w:rPr>
+                    <w:rFonts w:ascii="Times New Roman" w:eastAsia="Times New Roman" w:hAnsi="Times New Roman" w:cs="Times New Roman"/>
+                    <w:sz w:val="24"/>
+                    <w:szCs w:val="24"/>
+                    <w:lang w:eastAsia="fr-FR"/>
+                  </w:rPr>
+                  <w:t xml:space="preserve">Application de styles personnalisés avec </w:t>
+                </w:r>
+                <w:r>
+                  <w:rPr>
+                    <w:rFonts w:ascii="Times New Roman" w:eastAsia="Times New Roman" w:hAnsi="Times New Roman" w:cs="Times New Roman"/>
+                    <w:i/>
+                    <w:iCs/>
+                    <w:sz w:val="24"/>
+                    <w:szCs w:val="24"/>
+                    <w:lang w:eastAsia="fr-FR"/>
+                  </w:rPr>
+                  <w:t>CSS</w:t>
+                </w:r>
+                <w:r>
+                  <w:rPr>
+                    <w:rFonts w:ascii="Times New Roman" w:eastAsia="Times New Roman" w:hAnsi="Times New Roman" w:cs="Times New Roman"/>
+                    <w:sz w:val="24"/>
+                    <w:szCs w:val="24"/>
+                    <w:lang w:eastAsia="fr-FR"/>
+                  </w:rPr>
+                  <w:t>.</w:t>
+                </w:r>
+              </w:p>
+              <w:p>
+                <w:pPr>
+                  <w:pStyle w:val="Paragraphedeliste"/>
+                  <w:numPr>
+                    <w:ilvl w:val="0"/>
+                    <w:numId w:val="14"/>
+                  </w:numPr>
+                  <w:spacing w:before="100" w:beforeAutospacing="1" w:after="100" w:afterAutospacing="1"/>
+                  <w:rPr>
+                    <w:rFonts w:ascii="Times New Roman" w:eastAsia="Times New Roman" w:hAnsi="Times New Roman" w:cs="Times New Roman"/>
+                    <w:sz w:val="24"/>
+                    <w:szCs w:val="24"/>
+                    <w:lang w:eastAsia="fr-FR"/>
+                  </w:rPr>
+                </w:pPr>
+              </w:p>
+              <w:p>
+                <w:pPr>
+                  <w:pStyle w:val="Paragraphedeliste"/>
+                  <w:numPr>
+                    <w:ilvl w:val="0"/>
+                    <w:numId w:val="17"/>
+                  </w:numPr>
+                  <w:spacing w:before="100" w:beforeAutospacing="1" w:after="100" w:afterAutospacing="1"/>
+                  <w:rPr>
+                    <w:rFonts w:ascii="Times New Roman" w:eastAsia="Times New Roman" w:hAnsi="Times New Roman" w:cs="Times New Roman"/>
+                    <w:sz w:val="24"/>
+                    <w:szCs w:val="24"/>
+                    <w:lang w:eastAsia="fr-FR"/>
+                  </w:rPr>
+                </w:pPr>
+                <w:r>
+                  <w:rPr>
+                    <w:rFonts w:ascii="Times New Roman" w:eastAsia="Times New Roman" w:hAnsi="Times New Roman" w:cs="Times New Roman"/>
+                    <w:b/>
+                    <w:bCs/>
+                    <w:sz w:val="24"/>
+                    <w:szCs w:val="24"/>
+                    <w:lang w:eastAsia="fr-FR"/>
+                  </w:rPr>
+                  <w:t>Interactivité et dynamisme</w:t>
+                </w:r>
+              </w:p>
+              <w:p>
+                <w:pPr>
+                  <w:pStyle w:val="Paragraphedeliste"/>
+                  <w:spacing w:before="100" w:beforeAutospacing="1" w:after="100" w:afterAutospacing="1"/>
+                  <w:rPr>
+                    <w:rFonts w:ascii="Times New Roman" w:eastAsia="Times New Roman" w:hAnsi="Times New Roman" w:cs="Times New Roman"/>
+                    <w:sz w:val="24"/>
+                    <w:szCs w:val="24"/>
+                    <w:lang w:eastAsia="fr-FR"/>
+                  </w:rPr>
+                </w:pPr>
+                <w:r>
+                  <w:rPr>
+                    <w:rFonts w:ascii="Times New Roman" w:eastAsia="Times New Roman" w:hAnsi="Times New Roman" w:cs="Times New Roman"/>
+                    <w:b/>
+                    <w:bCs/>
+                    <w:sz w:val="24"/>
+                    <w:szCs w:val="24"/>
+                    <w:lang w:eastAsia="fr-FR"/>
+                  </w:rPr>
+                  <w:t xml:space="preserve">- </w:t>
+                </w:r>
+                <w:r>
+                  <w:rPr>
+                    <w:rFonts w:ascii="Times New Roman" w:eastAsia="Times New Roman" w:hAnsi="Times New Roman" w:cs="Times New Roman"/>
+                    <w:sz w:val="24"/>
+                    <w:szCs w:val="24"/>
+                    <w:lang w:eastAsia="fr-FR"/>
+                  </w:rPr>
+                  <w:t xml:space="preserve">Création d'un carrousel interactif avec </w:t>
+                </w:r>
+                <w:r>
+                  <w:rPr>
+                    <w:rFonts w:ascii="Times New Roman" w:eastAsia="Times New Roman" w:hAnsi="Times New Roman" w:cs="Times New Roman"/>
+                    <w:i/>
+                    <w:iCs/>
+                    <w:sz w:val="24"/>
+                    <w:szCs w:val="24"/>
+                    <w:lang w:eastAsia="fr-FR"/>
+                  </w:rPr>
+                  <w:t>JavaScrip</w:t>
+                </w:r>
+                <w:r>
+                  <w:rPr>
+                    <w:rFonts w:ascii="Times New Roman" w:eastAsia="Times New Roman" w:hAnsi="Times New Roman" w:cs="Times New Roman"/>
+                    <w:i/>
+                    <w:iCs/>
+                    <w:sz w:val="24"/>
+                    <w:szCs w:val="24"/>
+                    <w:lang w:eastAsia="fr-FR"/>
+                  </w:rPr>
+                  <w:t>t</w:t>
+                </w:r>
+                <w:r>
+                  <w:rPr>
+                    <w:rFonts w:ascii="Times New Roman" w:eastAsia="Times New Roman" w:hAnsi="Times New Roman" w:cs="Times New Roman"/>
+                    <w:sz w:val="24"/>
+                    <w:szCs w:val="24"/>
+                    <w:lang w:eastAsia="fr-FR"/>
+                  </w:rPr>
+                  <w:t>.</w:t>
+                </w:r>
+              </w:p>
+              <w:p>
+                <w:pPr>
                   <w:spacing w:before="120"/>
                   <w:rPr>
                     <w:rFonts w:cstheme="minorHAnsi"/>
@@ -4613,14 +5028,6 @@
                     <w:color w:val="404040" w:themeColor="text1" w:themeTint="BF"/>
                   </w:rPr>
                 </w:pPr>
-                <w:r>
-                  <w:rPr>
-                    <w:rFonts w:cstheme="minorHAnsi"/>
-                    <w:bCs/>
-                    <w:color w:val="404040" w:themeColor="text1" w:themeTint="BF"/>
-                  </w:rPr>
-                  <w:t>Texte</w:t>
-                </w:r>
               </w:p>
             </w:tc>
           </w:sdtContent>
@@ -4726,6 +5133,84 @@
                   <w:spacing w:before="120"/>
                   <w:rPr>
                     <w:rFonts w:cstheme="minorHAnsi"/>
+                    <w:bCs/>
+                    <w:color w:val="404040" w:themeColor="text1" w:themeTint="BF"/>
+                  </w:rPr>
+                </w:pPr>
+                <w:r>
+                  <w:rPr>
+                    <w:rFonts w:cstheme="minorHAnsi"/>
+                    <w:bCs/>
+                    <w:color w:val="404040" w:themeColor="text1" w:themeTint="BF"/>
+                  </w:rPr>
+                  <w:t xml:space="preserve">Maquettage : </w:t>
+                </w:r>
+                <w:r>
+                  <w:rPr>
+                    <w:rFonts w:cstheme="minorHAnsi"/>
+                    <w:b/>
+                    <w:color w:val="404040" w:themeColor="text1" w:themeTint="BF"/>
+                  </w:rPr>
+                  <w:t>FIGMA</w:t>
+                </w:r>
+              </w:p>
+              <w:p>
+                <w:pPr>
+                  <w:spacing w:before="120"/>
+                  <w:rPr>
+                    <w:rFonts w:cstheme="minorHAnsi"/>
+                    <w:bCs/>
+                    <w:color w:val="404040" w:themeColor="text1" w:themeTint="BF"/>
+                  </w:rPr>
+                </w:pPr>
+                <w:r>
+                  <w:rPr>
+                    <w:rFonts w:cstheme="minorHAnsi"/>
+                    <w:bCs/>
+                    <w:color w:val="404040" w:themeColor="text1" w:themeTint="BF"/>
+                  </w:rPr>
+                  <w:t xml:space="preserve">Langage de balisage : </w:t>
+                </w:r>
+                <w:r>
+                  <w:rPr>
+                    <w:rFonts w:cstheme="minorHAnsi"/>
+                    <w:b/>
+                    <w:color w:val="404040" w:themeColor="text1" w:themeTint="BF"/>
+                  </w:rPr>
+                  <w:t>HTML</w:t>
+                </w:r>
+              </w:p>
+              <w:p>
+                <w:pPr>
+                  <w:spacing w:before="120"/>
+                  <w:rPr>
+                    <w:rFonts w:cstheme="minorHAnsi"/>
+                    <w:bCs/>
+                    <w:color w:val="404040" w:themeColor="text1" w:themeTint="BF"/>
+                  </w:rPr>
+                </w:pPr>
+                <w:r>
+                  <w:rPr>
+                    <w:rFonts w:cstheme="minorHAnsi"/>
+                    <w:bCs/>
+                    <w:color w:val="404040" w:themeColor="text1" w:themeTint="BF"/>
+                  </w:rPr>
+                  <w:t xml:space="preserve">Langage de présentation : </w:t>
+                </w:r>
+                <w:r>
+                  <w:rPr>
+                    <w:rFonts w:cstheme="minorHAnsi"/>
+                    <w:b/>
+                    <w:color w:val="404040" w:themeColor="text1" w:themeTint="BF"/>
+                  </w:rPr>
+                  <w:t>CSS</w:t>
+                </w:r>
+              </w:p>
+              <w:p>
+                <w:pPr>
+                  <w:spacing w:before="120"/>
+                  <w:rPr>
+                    <w:rFonts w:cstheme="minorHAnsi"/>
                     <w:b/>
                     <w:color w:val="404040" w:themeColor="text1" w:themeTint="BF"/>
                   </w:rPr>
@@ -4736,7 +5221,15 @@
                     <w:bCs/>
                     <w:color w:val="404040" w:themeColor="text1" w:themeTint="BF"/>
                   </w:rPr>
-                  <w:t>Texte</w:t>
+                  <w:t xml:space="preserve">Langage de manipulation du DOM : </w:t>
+                </w:r>
+                <w:r>
+                  <w:rPr>
+                    <w:rFonts w:cstheme="minorHAnsi"/>
+                    <w:b/>
+                    <w:color w:val="404040" w:themeColor="text1" w:themeTint="BF"/>
+                  </w:rPr>
+                  <w:t>JS</w:t>
                 </w:r>
               </w:p>
             </w:tc>
@@ -4853,7 +5346,7 @@
                     <w:bCs/>
                     <w:color w:val="404040" w:themeColor="text1" w:themeTint="BF"/>
                   </w:rPr>
-                  <w:t>Texte</w:t>
+                  <w:t>Les formateurs d’Elan Formation</w:t>
                 </w:r>
               </w:p>
             </w:tc>
@@ -5044,7 +5537,6 @@
             <w:placeholder>
               <w:docPart w:val="1856905FF5E94CB481F00A2AABA47413"/>
             </w:placeholder>
-            <w:showingPlcHdr/>
           </w:sdtPr>
           <w:sdtEndPr>
             <w:rPr>
@@ -5073,11 +5565,12 @@
                 </w:pPr>
                 <w:r>
                   <w:rPr>
-                    <w:rStyle w:val="Textedelespacerserv"/>
+                    <w:rFonts w:cstheme="minorHAnsi"/>
                     <w:b/>
-                    <w:color w:val="404040" w:themeColor="text1" w:themeTint="BF"/>
+                    <w:i/>
+                    <w:color w:val="D60093"/>
                   </w:rPr>
-                  <w:t>Cliquez ici pour taper du texte.</w:t>
+                  <w:t>Elan Formation</w:t>
                 </w:r>
               </w:p>
             </w:tc>
@@ -5204,7 +5697,6 @@
             <w:placeholder>
               <w:docPart w:val="F458D095C4D0403D85AC20ED70FE3FF4"/>
             </w:placeholder>
-            <w:showingPlcHdr/>
           </w:sdtPr>
           <w:sdtEndPr/>
           <w:sdtContent>
@@ -5226,9 +5718,11 @@
                 </w:pPr>
                 <w:r>
                   <w:rPr>
-                    <w:rStyle w:val="Textedelespacerserv"/>
+                    <w:rFonts w:cstheme="minorHAnsi"/>
+                    <w:b/>
+                    <w:color w:val="404040" w:themeColor="text1" w:themeTint="BF"/>
                   </w:rPr>
-                  <w:t>Cliquez ici pour taper du texte.</w:t>
+                  <w:t>Equipe développeur web et web mobile</w:t>
                 </w:r>
               </w:p>
             </w:tc>
@@ -5332,8 +5826,7 @@
             <w:placeholder>
               <w:docPart w:val="3BCC42A3CB1A4766AE136C869A8E976E"/>
             </w:placeholder>
-            <w:showingPlcHdr/>
-            <w:date>
+            <w:date w:fullDate="2024-10-21T00:00:00Z">
               <w:dateFormat w:val="dd/MM/yyyy"/>
               <w:lid w:val="fr-FR"/>
               <w:storeMappedDataAs w:val="dateTime"/>
@@ -5357,15 +5850,11 @@
                 </w:pPr>
                 <w:r>
                   <w:rPr>
-                    <w:rStyle w:val="Textedelespacerserv"/>
+                    <w:rFonts w:cstheme="minorHAnsi"/>
+                    <w:b/>
+                    <w:color w:val="404040" w:themeColor="text1" w:themeTint="BF"/>
                   </w:rPr>
-                  <w:t>C</w:t>
-                </w:r>
-                <w:r>
-                  <w:rPr>
-                    <w:rStyle w:val="Textedelespacerserv"/>
-                  </w:rPr>
-                  <w:t>liquez ici</w:t>
+                  <w:t>21/10/2024</w:t>
                 </w:r>
               </w:p>
             </w:tc>
@@ -5406,7 +5895,7 @@
             <w:placeholder>
               <w:docPart w:val="6FFF817A39F6480698C6960A23B9BF5D"/>
             </w:placeholder>
-            <w:date>
+            <w:date w:fullDate="2025-05-28T00:00:00Z">
               <w:dateFormat w:val="dd/MM/yyyy"/>
               <w:lid w:val="fr-FR"/>
               <w:storeMappedDataAs w:val="dateTime"/>
@@ -5432,9 +5921,11 @@
                 </w:pPr>
                 <w:r>
                   <w:rPr>
-                    <w:rStyle w:val="Textedelespacerserv"/>
+                    <w:rFonts w:cstheme="minorHAnsi"/>
+                    <w:b/>
+                    <w:color w:val="404040" w:themeColor="text1" w:themeTint="BF"/>
                   </w:rPr>
-                  <w:t xml:space="preserve">Cliquez ici </w:t>
+                  <w:t>28/05/2025</w:t>
                 </w:r>
               </w:p>
             </w:tc>
@@ -10603,7 +11094,6 @@
             <w:placeholder>
               <w:docPart w:val="70CFA936422B4494A48BA471051844C0"/>
             </w:placeholder>
-            <w:showingPlcHdr/>
           </w:sdtPr>
           <w:sdtEndPr/>
           <w:sdtContent>
@@ -10627,11 +11117,12 @@
                 </w:pPr>
                 <w:r>
                   <w:rPr>
-                    <w:rStyle w:val="Textedelespacerserv"/>
+                    <w:rFonts w:cstheme="minorHAnsi"/>
+                    <w:b/>
                     <w:i/>
-                    <w:color w:val="404040" w:themeColor="text1" w:themeTint="BF"/>
+                    <w:color w:val="7F7F7F" w:themeColor="text1" w:themeTint="80"/>
                   </w:rPr>
-                  <w:t>Cliquez ici pour entrer l’intitulé de l’exemple</w:t>
+                  <w:t>Exercice Cinema</w:t>
                 </w:r>
               </w:p>
             </w:tc>
@@ -10720,54 +11211,420 @@
         <w:trPr>
           <w:trHeight w:val="4535"/>
         </w:trPr>
-        <w:sdt>
-          <w:sdtPr>
-            <w:rPr>
-              <w:rFonts w:cstheme="minorHAnsi"/>
-              <w:b/>
-              <w:color w:val="404040" w:themeColor="text1" w:themeTint="BF"/>
-            </w:rPr>
-            <w:alias w:val="1.Décrire tâches effectuées"/>
-            <w:tag w:val="1.Décrire tâches effectuées"/>
-            <w:id w:val="2031223222"/>
-            <w:placeholder>
-              <w:docPart w:val="C824B0BB85C9473F9A8165AF3FD67089"/>
-            </w:placeholder>
-          </w:sdtPr>
-          <w:sdtEndPr/>
-          <w:sdtContent>
-            <w:tc>
-              <w:tcPr>
-                <w:tcW w:w="9782" w:type="dxa"/>
-                <w:gridSpan w:val="9"/>
-                <w:tcBorders>
-                  <w:top w:val="single" w:sz="8" w:space="0" w:color="D60093"/>
-                  <w:left w:val="single" w:sz="4" w:space="0" w:color="D9D9D9" w:themeColor="background1" w:themeShade="D9"/>
-                  <w:bottom w:val="single" w:sz="4" w:space="0" w:color="D9D9D9" w:themeColor="background1" w:themeShade="D9"/>
-                  <w:right w:val="single" w:sz="4" w:space="0" w:color="D9D9D9" w:themeColor="background1" w:themeShade="D9"/>
-                </w:tcBorders>
-              </w:tcPr>
-              <w:p>
-                <w:pPr>
-                  <w:spacing w:before="120"/>
-                  <w:rPr>
-                    <w:rFonts w:cstheme="minorHAnsi"/>
-                    <w:b/>
-                    <w:color w:val="404040" w:themeColor="text1" w:themeTint="BF"/>
-                  </w:rPr>
-                </w:pPr>
-                <w:r>
-                  <w:rPr>
-                    <w:rFonts w:cstheme="minorHAnsi"/>
-                    <w:bCs/>
-                    <w:color w:val="404040" w:themeColor="text1" w:themeTint="BF"/>
-                  </w:rPr>
-                  <w:t>Texte</w:t>
-                </w:r>
-              </w:p>
-            </w:tc>
-          </w:sdtContent>
-        </w:sdt>
+        <w:tc>
+          <w:tcPr>
+            <w:tcW w:w="9782" w:type="dxa"/>
+            <w:gridSpan w:val="9"/>
+            <w:tcBorders>
+              <w:top w:val="single" w:sz="8" w:space="0" w:color="D60093"/>
+              <w:left w:val="single" w:sz="4" w:space="0" w:color="D9D9D9" w:themeColor="background1" w:themeShade="D9"/>
+              <w:bottom w:val="single" w:sz="4" w:space="0" w:color="D9D9D9" w:themeColor="background1" w:themeShade="D9"/>
+              <w:right w:val="single" w:sz="4" w:space="0" w:color="D9D9D9" w:themeColor="background1" w:themeShade="D9"/>
+            </w:tcBorders>
+          </w:tcPr>
+          <w:p>
+            <w:pPr>
+              <w:pStyle w:val="Paragraphedeliste"/>
+              <w:numPr>
+                <w:ilvl w:val="0"/>
+                <w:numId w:val="18"/>
+              </w:numPr>
+              <w:spacing w:before="120"/>
+              <w:rPr>
+                <w:rFonts w:cstheme="minorHAnsi"/>
+                <w:b/>
+                <w:color w:val="404040" w:themeColor="text1" w:themeTint="BF"/>
+              </w:rPr>
+            </w:pPr>
+            <w:r>
+              <w:rPr>
+                <w:rFonts w:cstheme="minorHAnsi"/>
+                <w:b/>
+                <w:color w:val="404040" w:themeColor="text1" w:themeTint="BF"/>
+              </w:rPr>
+              <w:t>Analyse</w:t>
+            </w:r>
+            <w:r>
+              <w:rPr>
+                <w:rFonts w:cstheme="minorHAnsi"/>
+                <w:b/>
+                <w:color w:val="404040" w:themeColor="text1" w:themeTint="BF"/>
+              </w:rPr>
+              <w:t xml:space="preserve"> des besoins</w:t>
+            </w:r>
+          </w:p>
+          <w:p>
+            <w:pPr>
+              <w:pStyle w:val="Paragraphedeliste"/>
+              <w:numPr>
+                <w:ilvl w:val="0"/>
+                <w:numId w:val="14"/>
+              </w:numPr>
+              <w:spacing w:before="120"/>
+              <w:rPr>
+                <w:rFonts w:cstheme="minorHAnsi"/>
+                <w:bCs/>
+                <w:color w:val="404040" w:themeColor="text1" w:themeTint="BF"/>
+              </w:rPr>
+            </w:pPr>
+            <w:r>
+              <w:rPr>
+                <w:rFonts w:cstheme="minorHAnsi"/>
+                <w:bCs/>
+                <w:color w:val="404040" w:themeColor="text1" w:themeTint="BF"/>
+              </w:rPr>
+              <w:t>Mise en place</w:t>
+            </w:r>
+            <w:r>
+              <w:rPr>
+                <w:rFonts w:cstheme="minorHAnsi"/>
+                <w:bCs/>
+                <w:color w:val="404040" w:themeColor="text1" w:themeTint="BF"/>
+              </w:rPr>
+              <w:t xml:space="preserve"> d’un suivi de projet</w:t>
+            </w:r>
+            <w:r>
+              <w:rPr>
+                <w:rFonts w:cstheme="minorHAnsi"/>
+                <w:bCs/>
+                <w:color w:val="404040" w:themeColor="text1" w:themeTint="BF"/>
+              </w:rPr>
+              <w:t>.</w:t>
+            </w:r>
+          </w:p>
+          <w:p>
+            <w:pPr>
+              <w:pStyle w:val="Paragraphedeliste"/>
+              <w:numPr>
+                <w:ilvl w:val="0"/>
+                <w:numId w:val="14"/>
+              </w:numPr>
+              <w:spacing w:before="120"/>
+              <w:rPr>
+                <w:rFonts w:cstheme="minorHAnsi"/>
+                <w:bCs/>
+                <w:i/>
+                <w:iCs/>
+                <w:color w:val="404040" w:themeColor="text1" w:themeTint="BF"/>
+              </w:rPr>
+            </w:pPr>
+            <w:r>
+              <w:rPr>
+                <w:rFonts w:cstheme="minorHAnsi"/>
+                <w:bCs/>
+                <w:color w:val="404040" w:themeColor="text1" w:themeTint="BF"/>
+              </w:rPr>
+              <w:t xml:space="preserve">Réalisation d’un </w:t>
+            </w:r>
+            <w:r>
+              <w:rPr>
+                <w:rFonts w:cstheme="minorHAnsi"/>
+                <w:bCs/>
+                <w:i/>
+                <w:iCs/>
+                <w:color w:val="404040" w:themeColor="text1" w:themeTint="BF"/>
+              </w:rPr>
+              <w:t>MCD</w:t>
+            </w:r>
+            <w:r>
+              <w:rPr>
+                <w:rFonts w:cstheme="minorHAnsi"/>
+                <w:bCs/>
+                <w:i/>
+                <w:iCs/>
+                <w:color w:val="404040" w:themeColor="text1" w:themeTint="BF"/>
+              </w:rPr>
+              <w:t xml:space="preserve"> (Modèle de Conception de Données)</w:t>
+            </w:r>
+            <w:r>
+              <w:rPr>
+                <w:rFonts w:cstheme="minorHAnsi"/>
+                <w:bCs/>
+                <w:color w:val="404040" w:themeColor="text1" w:themeTint="BF"/>
+              </w:rPr>
+              <w:t xml:space="preserve"> puis d’un </w:t>
+            </w:r>
+            <w:r>
+              <w:rPr>
+                <w:rFonts w:cstheme="minorHAnsi"/>
+                <w:bCs/>
+                <w:i/>
+                <w:iCs/>
+                <w:color w:val="404040" w:themeColor="text1" w:themeTint="BF"/>
+              </w:rPr>
+              <w:t>MLD</w:t>
+            </w:r>
+            <w:r>
+              <w:rPr>
+                <w:rFonts w:cstheme="minorHAnsi"/>
+                <w:bCs/>
+                <w:i/>
+                <w:iCs/>
+                <w:color w:val="404040" w:themeColor="text1" w:themeTint="BF"/>
+              </w:rPr>
+              <w:t xml:space="preserve"> (Modèle </w:t>
+            </w:r>
+            <w:r>
+              <w:rPr>
+                <w:rFonts w:cstheme="minorHAnsi"/>
+                <w:bCs/>
+                <w:i/>
+                <w:iCs/>
+                <w:color w:val="404040" w:themeColor="text1" w:themeTint="BF"/>
+              </w:rPr>
+              <w:t>Logique</w:t>
+            </w:r>
+            <w:r>
+              <w:rPr>
+                <w:rFonts w:cstheme="minorHAnsi"/>
+                <w:bCs/>
+                <w:i/>
+                <w:iCs/>
+                <w:color w:val="404040" w:themeColor="text1" w:themeTint="BF"/>
+              </w:rPr>
+              <w:t xml:space="preserve"> de Données</w:t>
+            </w:r>
+          </w:p>
+          <w:p>
+            <w:pPr>
+              <w:pStyle w:val="Paragraphedeliste"/>
+              <w:numPr>
+                <w:ilvl w:val="0"/>
+                <w:numId w:val="14"/>
+              </w:numPr>
+              <w:spacing w:before="120"/>
+              <w:rPr>
+                <w:rFonts w:cstheme="minorHAnsi"/>
+                <w:bCs/>
+                <w:color w:val="404040" w:themeColor="text1" w:themeTint="BF"/>
+              </w:rPr>
+            </w:pPr>
+            <w:r>
+              <w:rPr>
+                <w:rFonts w:cstheme="minorHAnsi"/>
+                <w:bCs/>
+                <w:color w:val="404040" w:themeColor="text1" w:themeTint="BF"/>
+              </w:rPr>
+              <w:t xml:space="preserve">Conception et implémentation de la </w:t>
+            </w:r>
+            <w:r>
+              <w:rPr>
+                <w:rFonts w:cstheme="minorHAnsi"/>
+                <w:bCs/>
+                <w:i/>
+                <w:iCs/>
+                <w:color w:val="404040" w:themeColor="text1" w:themeTint="BF"/>
+              </w:rPr>
+              <w:t xml:space="preserve">BDD </w:t>
+            </w:r>
+            <w:r>
+              <w:rPr>
+                <w:rFonts w:cstheme="minorHAnsi"/>
+                <w:bCs/>
+                <w:i/>
+                <w:iCs/>
+                <w:color w:val="404040" w:themeColor="text1" w:themeTint="BF"/>
+              </w:rPr>
+              <w:t>(</w:t>
+            </w:r>
+            <w:r>
+              <w:rPr>
+                <w:rFonts w:cstheme="minorHAnsi"/>
+                <w:bCs/>
+                <w:i/>
+                <w:iCs/>
+                <w:color w:val="404040" w:themeColor="text1" w:themeTint="BF"/>
+              </w:rPr>
+              <w:t>B</w:t>
+            </w:r>
+            <w:r>
+              <w:rPr>
+                <w:rFonts w:cstheme="minorHAnsi"/>
+                <w:bCs/>
+                <w:i/>
+                <w:iCs/>
+                <w:color w:val="404040" w:themeColor="text1" w:themeTint="BF"/>
+              </w:rPr>
+              <w:t xml:space="preserve">ase </w:t>
+            </w:r>
+            <w:r>
+              <w:rPr>
+                <w:rFonts w:cstheme="minorHAnsi"/>
+                <w:bCs/>
+                <w:i/>
+                <w:iCs/>
+                <w:color w:val="404040" w:themeColor="text1" w:themeTint="BF"/>
+              </w:rPr>
+              <w:t>D</w:t>
+            </w:r>
+            <w:r>
+              <w:rPr>
+                <w:rFonts w:cstheme="minorHAnsi"/>
+                <w:bCs/>
+                <w:i/>
+                <w:iCs/>
+                <w:color w:val="404040" w:themeColor="text1" w:themeTint="BF"/>
+              </w:rPr>
+              <w:t xml:space="preserve">e </w:t>
+            </w:r>
+            <w:r>
+              <w:rPr>
+                <w:rFonts w:cstheme="minorHAnsi"/>
+                <w:bCs/>
+                <w:i/>
+                <w:iCs/>
+                <w:color w:val="404040" w:themeColor="text1" w:themeTint="BF"/>
+              </w:rPr>
+              <w:t>D</w:t>
+            </w:r>
+            <w:r>
+              <w:rPr>
+                <w:rFonts w:cstheme="minorHAnsi"/>
+                <w:bCs/>
+                <w:i/>
+                <w:iCs/>
+                <w:color w:val="404040" w:themeColor="text1" w:themeTint="BF"/>
+              </w:rPr>
+              <w:t>onnées</w:t>
+            </w:r>
+            <w:r>
+              <w:rPr>
+                <w:rFonts w:cstheme="minorHAnsi"/>
+                <w:bCs/>
+                <w:i/>
+                <w:iCs/>
+                <w:color w:val="404040" w:themeColor="text1" w:themeTint="BF"/>
+              </w:rPr>
+              <w:t>)</w:t>
+            </w:r>
+          </w:p>
+          <w:p>
+            <w:pPr>
+              <w:pStyle w:val="Paragraphedeliste"/>
+              <w:spacing w:before="120"/>
+              <w:ind w:left="1080"/>
+              <w:rPr>
+                <w:rFonts w:cstheme="minorHAnsi"/>
+                <w:bCs/>
+                <w:color w:val="404040" w:themeColor="text1" w:themeTint="BF"/>
+              </w:rPr>
+            </w:pPr>
+          </w:p>
+          <w:p>
+            <w:pPr>
+              <w:pStyle w:val="Paragraphedeliste"/>
+              <w:numPr>
+                <w:ilvl w:val="0"/>
+                <w:numId w:val="18"/>
+              </w:numPr>
+              <w:spacing w:before="120"/>
+              <w:rPr>
+                <w:rFonts w:cstheme="minorHAnsi"/>
+                <w:bCs/>
+                <w:color w:val="404040" w:themeColor="text1" w:themeTint="BF"/>
+              </w:rPr>
+            </w:pPr>
+            <w:r>
+              <w:rPr>
+                <w:rFonts w:cstheme="minorHAnsi"/>
+                <w:bCs/>
+                <w:color w:val="404040" w:themeColor="text1" w:themeTint="BF"/>
+              </w:rPr>
+              <w:t xml:space="preserve">Développement et </w:t>
+            </w:r>
+            <w:r>
+              <w:rPr>
+                <w:rFonts w:cstheme="minorHAnsi"/>
+                <w:bCs/>
+                <w:color w:val="404040" w:themeColor="text1" w:themeTint="BF"/>
+              </w:rPr>
+              <w:t xml:space="preserve">architecture </w:t>
+            </w:r>
+          </w:p>
+          <w:p>
+            <w:pPr>
+              <w:pStyle w:val="Paragraphedeliste"/>
+              <w:numPr>
+                <w:ilvl w:val="0"/>
+                <w:numId w:val="14"/>
+              </w:numPr>
+              <w:spacing w:before="100" w:beforeAutospacing="1" w:after="100" w:afterAutospacing="1"/>
+              <w:rPr>
+                <w:rFonts w:eastAsia="Times New Roman" w:cstheme="minorHAnsi"/>
+                <w:lang w:eastAsia="fr-FR"/>
+              </w:rPr>
+            </w:pPr>
+            <w:r>
+              <w:rPr>
+                <w:rFonts w:eastAsia="Times New Roman" w:cstheme="minorHAnsi"/>
+                <w:lang w:eastAsia="fr-FR"/>
+              </w:rPr>
+              <w:t xml:space="preserve">Utilisation du modèle </w:t>
+            </w:r>
+            <w:r>
+              <w:rPr>
+                <w:rFonts w:eastAsia="Times New Roman" w:cstheme="minorHAnsi"/>
+                <w:i/>
+                <w:iCs/>
+                <w:lang w:eastAsia="fr-FR"/>
+              </w:rPr>
+              <w:t>MVC</w:t>
+            </w:r>
+            <w:r>
+              <w:rPr>
+                <w:rFonts w:eastAsia="Times New Roman" w:cstheme="minorHAnsi"/>
+                <w:lang w:eastAsia="fr-FR"/>
+              </w:rPr>
+              <w:t xml:space="preserve"> (Model-View-Controller) pour organiser le projet.</w:t>
+            </w:r>
+          </w:p>
+          <w:p>
+            <w:pPr>
+              <w:pStyle w:val="Paragraphedeliste"/>
+              <w:numPr>
+                <w:ilvl w:val="0"/>
+                <w:numId w:val="14"/>
+              </w:numPr>
+              <w:spacing w:before="100" w:beforeAutospacing="1" w:after="100" w:afterAutospacing="1"/>
+              <w:rPr>
+                <w:rFonts w:eastAsia="Times New Roman" w:cstheme="minorHAnsi"/>
+                <w:sz w:val="24"/>
+                <w:szCs w:val="24"/>
+                <w:lang w:eastAsia="fr-FR"/>
+              </w:rPr>
+            </w:pPr>
+            <w:r>
+              <w:rPr>
+                <w:rFonts w:cstheme="minorHAnsi"/>
+              </w:rPr>
+              <w:t xml:space="preserve">Intégration et utilisation de </w:t>
+            </w:r>
+            <w:r>
+              <w:rPr>
+                <w:rFonts w:cstheme="minorHAnsi"/>
+                <w:i/>
+                <w:iCs/>
+              </w:rPr>
+              <w:t>PDO (PHP Data Objects)</w:t>
+            </w:r>
+            <w:r>
+              <w:rPr>
+                <w:rFonts w:cstheme="minorHAnsi"/>
+              </w:rPr>
+              <w:t xml:space="preserve"> pour la gestion des interactions avec la base de données.</w:t>
+            </w:r>
+          </w:p>
+          <w:p>
+            <w:pPr>
+              <w:spacing w:before="120"/>
+              <w:rPr>
+                <w:rFonts w:cstheme="minorHAnsi"/>
+                <w:bCs/>
+                <w:color w:val="404040" w:themeColor="text1" w:themeTint="BF"/>
+              </w:rPr>
+            </w:pPr>
+          </w:p>
+        </w:tc>
       </w:tr>
       <w:tr>
         <w:trPr>
@@ -10869,6 +11726,162 @@
                   <w:spacing w:before="120"/>
                   <w:rPr>
                     <w:rFonts w:cstheme="minorHAnsi"/>
+                    <w:bCs/>
+                    <w:color w:val="404040" w:themeColor="text1" w:themeTint="BF"/>
+                  </w:rPr>
+                </w:pPr>
+                <w:r>
+                  <w:rPr>
+                    <w:rFonts w:cstheme="minorHAnsi"/>
+                    <w:bCs/>
+                    <w:color w:val="404040" w:themeColor="text1" w:themeTint="BF"/>
+                  </w:rPr>
+                  <w:t xml:space="preserve">Suivi de projet : </w:t>
+                </w:r>
+                <w:r>
+                  <w:rPr>
+                    <w:rFonts w:cstheme="minorHAnsi"/>
+                    <w:b/>
+                    <w:color w:val="404040" w:themeColor="text1" w:themeTint="BF"/>
+                  </w:rPr>
+                  <w:t>Trello</w:t>
+                </w:r>
+              </w:p>
+              <w:p>
+                <w:pPr>
+                  <w:spacing w:before="120"/>
+                  <w:rPr>
+                    <w:rFonts w:cstheme="minorHAnsi"/>
+                    <w:bCs/>
+                    <w:color w:val="404040" w:themeColor="text1" w:themeTint="BF"/>
+                  </w:rPr>
+                </w:pPr>
+                <w:r>
+                  <w:rPr>
+                    <w:rFonts w:cstheme="minorHAnsi"/>
+                    <w:bCs/>
+                    <w:color w:val="404040" w:themeColor="text1" w:themeTint="BF"/>
+                  </w:rPr>
+                  <w:t xml:space="preserve">Outil de modélisations : </w:t>
+                </w:r>
+                <w:r>
+                  <w:rPr>
+                    <w:rFonts w:cstheme="minorHAnsi"/>
+                    <w:b/>
+                    <w:color w:val="404040" w:themeColor="text1" w:themeTint="BF"/>
+                  </w:rPr>
+                  <w:t>Looping</w:t>
+                </w:r>
+              </w:p>
+              <w:p>
+                <w:pPr>
+                  <w:spacing w:before="120"/>
+                  <w:rPr>
+                    <w:rFonts w:cstheme="minorHAnsi"/>
+                    <w:bCs/>
+                    <w:color w:val="404040" w:themeColor="text1" w:themeTint="BF"/>
+                  </w:rPr>
+                </w:pPr>
+                <w:r>
+                  <w:rPr>
+                    <w:rFonts w:cstheme="minorHAnsi"/>
+                    <w:bCs/>
+                    <w:color w:val="404040" w:themeColor="text1" w:themeTint="BF"/>
+                  </w:rPr>
+                  <w:t xml:space="preserve">Utilisation d’un environnement de développement : </w:t>
+                </w:r>
+                <w:r>
+                  <w:rPr>
+                    <w:rFonts w:cstheme="minorHAnsi"/>
+                    <w:b/>
+                    <w:color w:val="404040" w:themeColor="text1" w:themeTint="BF"/>
+                  </w:rPr>
+                  <w:t>Laragon</w:t>
+                </w:r>
+              </w:p>
+              <w:p>
+                <w:pPr>
+                  <w:spacing w:before="120"/>
+                  <w:rPr>
+                    <w:rFonts w:cstheme="minorHAnsi"/>
+                    <w:bCs/>
+                    <w:color w:val="404040" w:themeColor="text1" w:themeTint="BF"/>
+                  </w:rPr>
+                </w:pPr>
+                <w:r>
+                  <w:rPr>
+                    <w:rFonts w:cstheme="minorHAnsi"/>
+                    <w:bCs/>
+                    <w:color w:val="404040" w:themeColor="text1" w:themeTint="BF"/>
+                  </w:rPr>
+                  <w:t xml:space="preserve">Outil de gestion de la BDD : </w:t>
+                </w:r>
+                <w:r>
+                  <w:rPr>
+                    <w:rFonts w:cstheme="minorHAnsi"/>
+                    <w:b/>
+                    <w:color w:val="404040" w:themeColor="text1" w:themeTint="BF"/>
+                  </w:rPr>
+                  <w:t>HeidiSQL</w:t>
+                </w:r>
+              </w:p>
+              <w:p>
+                <w:pPr>
+                  <w:spacing w:before="120"/>
+                  <w:rPr>
+                    <w:rFonts w:cstheme="minorHAnsi"/>
+                    <w:bCs/>
+                    <w:color w:val="404040" w:themeColor="text1" w:themeTint="BF"/>
+                  </w:rPr>
+                </w:pPr>
+                <w:r>
+                  <w:rPr>
+                    <w:rFonts w:cstheme="minorHAnsi"/>
+                    <w:bCs/>
+                    <w:color w:val="404040" w:themeColor="text1" w:themeTint="BF"/>
+                  </w:rPr>
+                  <w:t xml:space="preserve">Système de Gestion de Base de Données Relationnel : </w:t>
+                </w:r>
+                <w:r>
+                  <w:rPr>
+                    <w:rFonts w:cstheme="minorHAnsi"/>
+                    <w:b/>
+                    <w:color w:val="404040" w:themeColor="text1" w:themeTint="BF"/>
+                  </w:rPr>
+                  <w:t>MySql</w:t>
+                </w:r>
+              </w:p>
+              <w:p>
+                <w:pPr>
+                  <w:spacing w:before="120"/>
+                  <w:rPr>
+                    <w:rFonts w:cstheme="minorHAnsi"/>
+                    <w:bCs/>
+                    <w:color w:val="404040" w:themeColor="text1" w:themeTint="BF"/>
+                  </w:rPr>
+                </w:pPr>
+                <w:r>
+                  <w:rPr>
+                    <w:rFonts w:cstheme="minorHAnsi"/>
+                    <w:bCs/>
+                    <w:color w:val="404040" w:themeColor="text1" w:themeTint="BF"/>
+                  </w:rPr>
+                  <w:t xml:space="preserve">Langage de requêtes : </w:t>
+                </w:r>
+                <w:r>
+                  <w:rPr>
+                    <w:rFonts w:cstheme="minorHAnsi"/>
+                    <w:b/>
+                    <w:color w:val="404040" w:themeColor="text1" w:themeTint="BF"/>
+                  </w:rPr>
+                  <w:t>SQL</w:t>
+                </w:r>
+              </w:p>
+              <w:p>
+                <w:pPr>
+                  <w:spacing w:before="120"/>
+                  <w:rPr>
+                    <w:rFonts w:cstheme="minorHAnsi"/>
                     <w:b/>
                     <w:color w:val="404040" w:themeColor="text1" w:themeTint="BF"/>
                   </w:rPr>
@@ -10879,7 +11892,15 @@
                     <w:bCs/>
                     <w:color w:val="404040" w:themeColor="text1" w:themeTint="BF"/>
                   </w:rPr>
-                  <w:t>Texte</w:t>
+                  <w:t xml:space="preserve">Langage de programmation : </w:t>
+                </w:r>
+                <w:r>
+                  <w:rPr>
+                    <w:rFonts w:cstheme="minorHAnsi"/>
+                    <w:b/>
+                    <w:color w:val="404040" w:themeColor="text1" w:themeTint="BF"/>
+                  </w:rPr>
+                  <w:t>PHP</w:t>
                 </w:r>
               </w:p>
             </w:tc>
@@ -11123,7 +12144,7 @@
                     <w:bCs/>
                     <w:color w:val="404040" w:themeColor="text1" w:themeTint="BF"/>
                   </w:rPr>
-                  <w:t>Texte</w:t>
+                  <w:t>Les formateurs d’Elan Formation</w:t>
                 </w:r>
               </w:p>
             </w:tc>
@@ -11300,7 +12321,6 @@
             <w:placeholder>
               <w:docPart w:val="E2D0E1BCD98F4C2CABA187B8CE21621B"/>
             </w:placeholder>
-            <w:showingPlcHdr/>
           </w:sdtPr>
           <w:sdtEndPr>
             <w:rPr>
@@ -11329,11 +12349,12 @@
                 </w:pPr>
                 <w:r>
                   <w:rPr>
-                    <w:rStyle w:val="Textedelespacerserv"/>
+                    <w:rFonts w:cstheme="minorHAnsi"/>
                     <w:b/>
-                    <w:color w:val="404040" w:themeColor="text1" w:themeTint="BF"/>
+                    <w:i/>
+                    <w:color w:val="D60093"/>
                   </w:rPr>
-                  <w:t>Cliquez ici pour taper du texte.</w:t>
+                  <w:t>Elan Formation</w:t>
                 </w:r>
               </w:p>
             </w:tc>
@@ -11457,34 +12478,53 @@
             <w:placeholder>
               <w:docPart w:val="D4332E2BF0874F68ABEDC034923E7898"/>
             </w:placeholder>
-            <w:showingPlcHdr/>
           </w:sdtPr>
           <w:sdtEndPr/>
           <w:sdtContent>
-            <w:tc>
-              <w:tcPr>
-                <w:tcW w:w="6852" w:type="dxa"/>
-                <w:gridSpan w:val="6"/>
-                <w:tcBorders>
-                  <w:right w:val="single" w:sz="4" w:space="0" w:color="D9D9D9" w:themeColor="background1" w:themeShade="D9"/>
-                </w:tcBorders>
-              </w:tcPr>
-              <w:p>
-                <w:pPr>
-                  <w:rPr>
-                    <w:rFonts w:cstheme="minorHAnsi"/>
-                    <w:b/>
-                    <w:color w:val="404040" w:themeColor="text1" w:themeTint="BF"/>
-                  </w:rPr>
-                </w:pPr>
-                <w:r>
-                  <w:rPr>
-                    <w:rStyle w:val="Textedelespacerserv"/>
-                  </w:rPr>
-                  <w:t>Cliquez ici pour taper du texte.</w:t>
-                </w:r>
-              </w:p>
-            </w:tc>
+            <w:sdt>
+              <w:sdtPr>
+                <w:rPr>
+                  <w:rFonts w:cstheme="minorHAnsi"/>
+                  <w:b/>
+                  <w:color w:val="404040" w:themeColor="text1" w:themeTint="BF"/>
+                </w:rPr>
+                <w:alias w:val="AT1 - Chantier"/>
+                <w:tag w:val="AT1 - Chantier"/>
+                <w:id w:val="-331530571"/>
+                <w:placeholder>
+                  <w:docPart w:val="7583E23F15194DFBABD56FE9E71B614C"/>
+                </w:placeholder>
+              </w:sdtPr>
+              <w:sdtEndPr/>
+              <w:sdtContent>
+                <w:tc>
+                  <w:tcPr>
+                    <w:tcW w:w="6852" w:type="dxa"/>
+                    <w:gridSpan w:val="6"/>
+                    <w:tcBorders>
+                      <w:right w:val="single" w:sz="4" w:space="0" w:color="D9D9D9" w:themeColor="background1" w:themeShade="D9"/>
+                    </w:tcBorders>
+                  </w:tcPr>
+                  <w:p>
+                    <w:pPr>
+                      <w:rPr>
+                        <w:rFonts w:cstheme="minorHAnsi"/>
+                        <w:b/>
+                        <w:color w:val="404040" w:themeColor="text1" w:themeTint="BF"/>
+                      </w:rPr>
+                    </w:pPr>
+                    <w:r>
+                      <w:rPr>
+                        <w:rFonts w:cstheme="minorHAnsi"/>
+                        <w:b/>
+                        <w:color w:val="404040" w:themeColor="text1" w:themeTint="BF"/>
+                      </w:rPr>
+                      <w:t>Equipe développeur web et web mobile</w:t>
+                    </w:r>
+                  </w:p>
+                </w:tc>
+              </w:sdtContent>
+            </w:sdt>
           </w:sdtContent>
         </w:sdt>
       </w:tr>
@@ -11585,8 +12625,7 @@
             <w:placeholder>
               <w:docPart w:val="14D24C3E016649089D2E08E48AFADE2A"/>
             </w:placeholder>
-            <w:showingPlcHdr/>
-            <w:date>
+            <w:date w:fullDate="2024-10-21T00:00:00Z">
               <w:dateFormat w:val="dd/MM/yyyy"/>
               <w:lid w:val="fr-FR"/>
               <w:storeMappedDataAs w:val="dateTime"/>
@@ -11610,15 +12649,11 @@
                 </w:pPr>
                 <w:r>
                   <w:rPr>
-                    <w:rStyle w:val="Textedelespacerserv"/>
+                    <w:rFonts w:cstheme="minorHAnsi"/>
+                    <w:b/>
+                    <w:color w:val="404040" w:themeColor="text1" w:themeTint="BF"/>
                   </w:rPr>
-                  <w:t>C</w:t>
-                </w:r>
-                <w:r>
-                  <w:rPr>
-                    <w:rStyle w:val="Textedelespacerserv"/>
-                  </w:rPr>
-                  <w:t>liquez ici</w:t>
+                  <w:t>21/10/2024</w:t>
                 </w:r>
               </w:p>
             </w:tc>
@@ -11659,7 +12694,7 @@
             <w:placeholder>
               <w:docPart w:val="F16952B72792468391140E83B20EA95A"/>
             </w:placeholder>
-            <w:date>
+            <w:date w:fullDate="2025-05-28T00:00:00Z">
               <w:dateFormat w:val="dd/MM/yyyy"/>
               <w:lid w:val="fr-FR"/>
               <w:storeMappedDataAs w:val="dateTime"/>
@@ -11685,9 +12720,11 @@
                 </w:pPr>
                 <w:r>
                   <w:rPr>
-                    <w:rStyle w:val="Textedelespacerserv"/>
+                    <w:rFonts w:cstheme="minorHAnsi"/>
+                    <w:b/>
+                    <w:color w:val="404040" w:themeColor="text1" w:themeTint="BF"/>
                   </w:rPr>
-                  <w:t xml:space="preserve">Cliquez ici </w:t>
+                  <w:t>28/05/2025</w:t>
                 </w:r>
               </w:p>
             </w:tc>
@@ -18449,6 +19486,335 @@
     </w:lvl>
   </w:abstractNum>
   <w:abstractNum w:abstractNumId="1" w15:restartNumberingAfterBreak="0">
+    <w:nsid w:val="04EC0275"/>
+    <w:multiLevelType w:val="hybridMultilevel"/>
+    <w:tmpl w:val="803E5712"/>
+    <w:lvl w:ilvl="0" w:tplc="040C000F">
+      <w:start w:val="1"/>
+      <w:numFmt w:val="decimal"/>
+      <w:lvlText w:val="%1."/>
+      <w:lvlJc w:val="left"/>
+      <w:pPr>
+        <w:ind w:left="720" w:hanging="360"/>
+      </w:pPr>
+      <w:rPr>
+        <w:rFonts w:hint="default"/>
+        <w:b w:val="0"/>
+      </w:rPr>
+    </w:lvl>
+    <w:lvl w:ilvl="1" w:tplc="040C0019" w:tentative="1">
+      <w:start w:val="1"/>
+      <w:numFmt w:val="lowerLetter"/>
+      <w:lvlText w:val="%2."/>
+      <w:lvlJc w:val="left"/>
+      <w:pPr>
+        <w:ind w:left="1440" w:hanging="360"/>
+      </w:pPr>
+    </w:lvl>
+    <w:lvl w:ilvl="2" w:tplc="040C001B" w:tentative="1">
+      <w:start w:val="1"/>
+      <w:numFmt w:val="lowerRoman"/>
+      <w:lvlText w:val="%3."/>
+      <w:lvlJc w:val="right"/>
+      <w:pPr>
+        <w:ind w:left="2160" w:hanging="180"/>
+      </w:pPr>
+    </w:lvl>
+    <w:lvl w:ilvl="3" w:tplc="040C000F" w:tentative="1">
+      <w:start w:val="1"/>
+      <w:numFmt w:val="decimal"/>
+      <w:lvlText w:val="%4."/>
+      <w:lvlJc w:val="left"/>
+      <w:pPr>
+        <w:ind w:left="2880" w:hanging="360"/>
+      </w:pPr>
+    </w:lvl>
+    <w:lvl w:ilvl="4" w:tplc="040C0019" w:tentative="1">
+      <w:start w:val="1"/>
+      <w:numFmt w:val="lowerLetter"/>
+      <w:lvlText w:val="%5."/>
+      <w:lvlJc w:val="left"/>
+      <w:pPr>
+        <w:ind w:left="3600" w:hanging="360"/>
+      </w:pPr>
+    </w:lvl>
+    <w:lvl w:ilvl="5" w:tplc="040C001B" w:tentative="1">
+      <w:start w:val="1"/>
+      <w:numFmt w:val="lowerRoman"/>
+      <w:lvlText w:val="%6."/>
+      <w:lvlJc w:val="right"/>
+      <w:pPr>
+        <w:ind w:left="4320" w:hanging="180"/>
+      </w:pPr>
+    </w:lvl>
+    <w:lvl w:ilvl="6" w:tplc="040C000F" w:tentative="1">
+      <w:start w:val="1"/>
+      <w:numFmt w:val="decimal"/>
+      <w:lvlText w:val="%7."/>
+      <w:lvlJc w:val="left"/>
+      <w:pPr>
+        <w:ind w:left="5040" w:hanging="360"/>
+      </w:pPr>
+    </w:lvl>
+    <w:lvl w:ilvl="7" w:tplc="040C0019" w:tentative="1">
+      <w:start w:val="1"/>
+      <w:numFmt w:val="lowerLetter"/>
+      <w:lvlText w:val="%8."/>
+      <w:lvlJc w:val="left"/>
+      <w:pPr>
+        <w:ind w:left="5760" w:hanging="360"/>
+      </w:pPr>
+    </w:lvl>
+    <w:lvl w:ilvl="8" w:tplc="040C001B" w:tentative="1">
+      <w:start w:val="1"/>
+      <w:numFmt w:val="lowerRoman"/>
+      <w:lvlText w:val="%9."/>
+      <w:lvlJc w:val="right"/>
+      <w:pPr>
+        <w:ind w:left="6480" w:hanging="180"/>
+      </w:pPr>
+    </w:lvl>
+  </w:abstractNum>
+  <w:abstractNum w:abstractNumId="2" w15:restartNumberingAfterBreak="0">
+    <w:nsid w:val="0A417F09"/>
+    <w:multiLevelType w:val="multilevel"/>
+    <w:tmpl w:val="B332F432"/>
+    <w:lvl w:ilvl="0">
+      <w:start w:val="1"/>
+      <w:numFmt w:val="bullet"/>
+      <w:lvlText w:val=""/>
+      <w:lvlJc w:val="left"/>
+      <w:pPr>
+        <w:tabs>
+          <w:tab w:val="num" w:pos="720"/>
+        </w:tabs>
+        <w:ind w:left="720" w:hanging="360"/>
+      </w:pPr>
+      <w:rPr>
+        <w:rFonts w:ascii="Symbol" w:hAnsi="Symbol" w:hint="default"/>
+        <w:sz w:val="20"/>
+      </w:rPr>
+    </w:lvl>
+    <w:lvl w:ilvl="1" w:tentative="1">
+      <w:start w:val="1"/>
+      <w:numFmt w:val="bullet"/>
+      <w:lvlText w:val="o"/>
+      <w:lvlJc w:val="left"/>
+      <w:pPr>
+        <w:tabs>
+          <w:tab w:val="num" w:pos="1440"/>
+        </w:tabs>
+        <w:ind w:left="1440" w:hanging="360"/>
+      </w:pPr>
+      <w:rPr>
+        <w:rFonts w:ascii="Courier New" w:hAnsi="Courier New" w:hint="default"/>
+        <w:sz w:val="20"/>
+      </w:rPr>
+    </w:lvl>
+    <w:lvl w:ilvl="2" w:tentative="1">
+      <w:start w:val="1"/>
+      <w:numFmt w:val="bullet"/>
+      <w:lvlText w:val=""/>
+      <w:lvlJc w:val="left"/>
+      <w:pPr>
+        <w:tabs>
+          <w:tab w:val="num" w:pos="2160"/>
+        </w:tabs>
+        <w:ind w:left="2160" w:hanging="360"/>
+      </w:pPr>
+      <w:rPr>
+        <w:rFonts w:ascii="Wingdings" w:hAnsi="Wingdings" w:hint="default"/>
+        <w:sz w:val="20"/>
+      </w:rPr>
+    </w:lvl>
+    <w:lvl w:ilvl="3" w:tentative="1">
+      <w:start w:val="1"/>
+      <w:numFmt w:val="bullet"/>
+      <w:lvlText w:val=""/>
+      <w:lvlJc w:val="left"/>
+      <w:pPr>
+        <w:tabs>
+          <w:tab w:val="num" w:pos="2880"/>
+        </w:tabs>
+        <w:ind w:left="2880" w:hanging="360"/>
+      </w:pPr>
+      <w:rPr>
+        <w:rFonts w:ascii="Wingdings" w:hAnsi="Wingdings" w:hint="default"/>
+        <w:sz w:val="20"/>
+      </w:rPr>
+    </w:lvl>
+    <w:lvl w:ilvl="4" w:tentative="1">
+      <w:start w:val="1"/>
+      <w:numFmt w:val="bullet"/>
+      <w:lvlText w:val=""/>
+      <w:lvlJc w:val="left"/>
+      <w:pPr>
+        <w:tabs>
+          <w:tab w:val="num" w:pos="3600"/>
+        </w:tabs>
+        <w:ind w:left="3600" w:hanging="360"/>
+      </w:pPr>
+      <w:rPr>
+        <w:rFonts w:ascii="Wingdings" w:hAnsi="Wingdings" w:hint="default"/>
+        <w:sz w:val="20"/>
+      </w:rPr>
+    </w:lvl>
+    <w:lvl w:ilvl="5" w:tentative="1">
+      <w:start w:val="1"/>
+      <w:numFmt w:val="bullet"/>
+      <w:lvlText w:val=""/>
+      <w:lvlJc w:val="left"/>
+      <w:pPr>
+        <w:tabs>
+          <w:tab w:val="num" w:pos="4320"/>
+        </w:tabs>
+        <w:ind w:left="4320" w:hanging="360"/>
+      </w:pPr>
+      <w:rPr>
+        <w:rFonts w:ascii="Wingdings" w:hAnsi="Wingdings" w:hint="default"/>
+        <w:sz w:val="20"/>
+      </w:rPr>
+    </w:lvl>
+    <w:lvl w:ilvl="6" w:tentative="1">
+      <w:start w:val="1"/>
+      <w:numFmt w:val="bullet"/>
+      <w:lvlText w:val=""/>
+      <w:lvlJc w:val="left"/>
+      <w:pPr>
+        <w:tabs>
+          <w:tab w:val="num" w:pos="5040"/>
+        </w:tabs>
+        <w:ind w:left="5040" w:hanging="360"/>
+      </w:pPr>
+      <w:rPr>
+        <w:rFonts w:ascii="Wingdings" w:hAnsi="Wingdings" w:hint="default"/>
+        <w:sz w:val="20"/>
+      </w:rPr>
+    </w:lvl>
+    <w:lvl w:ilvl="7" w:tentative="1">
+      <w:start w:val="1"/>
+      <w:numFmt w:val="bullet"/>
+      <w:lvlText w:val=""/>
+      <w:lvlJc w:val="left"/>
+      <w:pPr>
+        <w:tabs>
+          <w:tab w:val="num" w:pos="5760"/>
+        </w:tabs>
+        <w:ind w:left="5760" w:hanging="360"/>
+      </w:pPr>
+      <w:rPr>
+        <w:rFonts w:ascii="Wingdings" w:hAnsi="Wingdings" w:hint="default"/>
+        <w:sz w:val="20"/>
+      </w:rPr>
+    </w:lvl>
+    <w:lvl w:ilvl="8" w:tentative="1">
+      <w:start w:val="1"/>
+      <w:numFmt w:val="bullet"/>
+      <w:lvlText w:val=""/>
+      <w:lvlJc w:val="left"/>
+      <w:pPr>
+        <w:tabs>
+          <w:tab w:val="num" w:pos="6480"/>
+        </w:tabs>
+        <w:ind w:left="6480" w:hanging="360"/>
+      </w:pPr>
+      <w:rPr>
+        <w:rFonts w:ascii="Wingdings" w:hAnsi="Wingdings" w:hint="default"/>
+        <w:sz w:val="20"/>
+      </w:rPr>
+    </w:lvl>
+  </w:abstractNum>
+  <w:abstractNum w:abstractNumId="3" w15:restartNumberingAfterBreak="0">
+    <w:nsid w:val="10BD463E"/>
+    <w:multiLevelType w:val="hybridMultilevel"/>
+    <w:tmpl w:val="1C02D5A0"/>
+    <w:lvl w:ilvl="0" w:tplc="040C000F">
+      <w:start w:val="1"/>
+      <w:numFmt w:val="decimal"/>
+      <w:lvlText w:val="%1."/>
+      <w:lvlJc w:val="left"/>
+      <w:pPr>
+        <w:ind w:left="720" w:hanging="360"/>
+      </w:pPr>
+      <w:rPr>
+        <w:rFonts w:hint="default"/>
+        <w:b w:val="0"/>
+      </w:rPr>
+    </w:lvl>
+    <w:lvl w:ilvl="1" w:tplc="040C0019" w:tentative="1">
+      <w:start w:val="1"/>
+      <w:numFmt w:val="lowerLetter"/>
+      <w:lvlText w:val="%2."/>
+      <w:lvlJc w:val="left"/>
+      <w:pPr>
+        <w:ind w:left="1440" w:hanging="360"/>
+      </w:pPr>
+    </w:lvl>
+    <w:lvl w:ilvl="2" w:tplc="040C001B" w:tentative="1">
+      <w:start w:val="1"/>
+      <w:numFmt w:val="lowerRoman"/>
+      <w:lvlText w:val="%3."/>
+      <w:lvlJc w:val="right"/>
+      <w:pPr>
+        <w:ind w:left="2160" w:hanging="180"/>
+      </w:pPr>
+    </w:lvl>
+    <w:lvl w:ilvl="3" w:tplc="040C000F" w:tentative="1">
+      <w:start w:val="1"/>
+      <w:numFmt w:val="decimal"/>
+      <w:lvlText w:val="%4."/>
+      <w:lvlJc w:val="left"/>
+      <w:pPr>
+        <w:ind w:left="2880" w:hanging="360"/>
+      </w:pPr>
+    </w:lvl>
+    <w:lvl w:ilvl="4" w:tplc="040C0019" w:tentative="1">
+      <w:start w:val="1"/>
+      <w:numFmt w:val="lowerLetter"/>
+      <w:lvlText w:val="%5."/>
+      <w:lvlJc w:val="left"/>
+      <w:pPr>
+        <w:ind w:left="3600" w:hanging="360"/>
+      </w:pPr>
+    </w:lvl>
+    <w:lvl w:ilvl="5" w:tplc="040C001B" w:tentative="1">
+      <w:start w:val="1"/>
+      <w:numFmt w:val="lowerRoman"/>
+      <w:lvlText w:val="%6."/>
+      <w:lvlJc w:val="right"/>
+      <w:pPr>
+        <w:ind w:left="4320" w:hanging="180"/>
+      </w:pPr>
+    </w:lvl>
+    <w:lvl w:ilvl="6" w:tplc="040C000F" w:tentative="1">
+      <w:start w:val="1"/>
+      <w:numFmt w:val="decimal"/>
+      <w:lvlText w:val="%7."/>
+      <w:lvlJc w:val="left"/>
+      <w:pPr>
+        <w:ind w:left="5040" w:hanging="360"/>
+      </w:pPr>
+    </w:lvl>
+    <w:lvl w:ilvl="7" w:tplc="040C0019" w:tentative="1">
+      <w:start w:val="1"/>
+      <w:numFmt w:val="lowerLetter"/>
+      <w:lvlText w:val="%8."/>
+      <w:lvlJc w:val="left"/>
+      <w:pPr>
+        <w:ind w:left="5760" w:hanging="360"/>
+      </w:pPr>
+    </w:lvl>
+    <w:lvl w:ilvl="8" w:tplc="040C001B" w:tentative="1">
+      <w:start w:val="1"/>
+      <w:numFmt w:val="lowerRoman"/>
+      <w:lvlText w:val="%9."/>
+      <w:lvlJc w:val="right"/>
+      <w:pPr>
+        <w:ind w:left="6480" w:hanging="180"/>
+      </w:pPr>
+    </w:lvl>
+  </w:abstractNum>
+  <w:abstractNum w:abstractNumId="4" w15:restartNumberingAfterBreak="0">
     <w:nsid w:val="130D1F71"/>
     <w:multiLevelType w:val="hybridMultilevel"/>
     <w:tmpl w:val="7C543926"/>
@@ -18561,7 +19927,234 @@
       </w:rPr>
     </w:lvl>
   </w:abstractNum>
-  <w:abstractNum w:abstractNumId="2" w15:restartNumberingAfterBreak="0">
+  <w:abstractNum w:abstractNumId="5" w15:restartNumberingAfterBreak="0">
+    <w:nsid w:val="1AB37288"/>
+    <w:multiLevelType w:val="hybridMultilevel"/>
+    <w:tmpl w:val="D690F1AA"/>
+    <w:lvl w:ilvl="0" w:tplc="54BAB414">
+      <w:start w:val="1"/>
+      <w:numFmt w:val="bullet"/>
+      <w:lvlText w:val="-"/>
+      <w:lvlJc w:val="left"/>
+      <w:pPr>
+        <w:ind w:left="1080" w:hanging="360"/>
+      </w:pPr>
+      <w:rPr>
+        <w:rFonts w:ascii="Times New Roman" w:eastAsia="Times New Roman" w:hAnsi="Times New Roman" w:cs="Times New Roman" w:hint="default"/>
+      </w:rPr>
+    </w:lvl>
+    <w:lvl w:ilvl="1" w:tplc="040C0003" w:tentative="1">
+      <w:start w:val="1"/>
+      <w:numFmt w:val="bullet"/>
+      <w:lvlText w:val="o"/>
+      <w:lvlJc w:val="left"/>
+      <w:pPr>
+        <w:ind w:left="1800" w:hanging="360"/>
+      </w:pPr>
+      <w:rPr>
+        <w:rFonts w:ascii="Courier New" w:hAnsi="Courier New" w:cs="Courier New" w:hint="default"/>
+      </w:rPr>
+    </w:lvl>
+    <w:lvl w:ilvl="2" w:tplc="040C0005" w:tentative="1">
+      <w:start w:val="1"/>
+      <w:numFmt w:val="bullet"/>
+      <w:lvlText w:val=""/>
+      <w:lvlJc w:val="left"/>
+      <w:pPr>
+        <w:ind w:left="2520" w:hanging="360"/>
+      </w:pPr>
+      <w:rPr>
+        <w:rFonts w:ascii="Wingdings" w:hAnsi="Wingdings" w:hint="default"/>
+      </w:rPr>
+    </w:lvl>
+    <w:lvl w:ilvl="3" w:tplc="040C0001" w:tentative="1">
+      <w:start w:val="1"/>
+      <w:numFmt w:val="bullet"/>
+      <w:lvlText w:val=""/>
+      <w:lvlJc w:val="left"/>
+      <w:pPr>
+        <w:ind w:left="3240" w:hanging="360"/>
+      </w:pPr>
+      <w:rPr>
+        <w:rFonts w:ascii="Symbol" w:hAnsi="Symbol" w:hint="default"/>
+      </w:rPr>
+    </w:lvl>
+    <w:lvl w:ilvl="4" w:tplc="040C0003" w:tentative="1">
+      <w:start w:val="1"/>
+      <w:numFmt w:val="bullet"/>
+      <w:lvlText w:val="o"/>
+      <w:lvlJc w:val="left"/>
+      <w:pPr>
+        <w:ind w:left="3960" w:hanging="360"/>
+      </w:pPr>
+      <w:rPr>
+        <w:rFonts w:ascii="Courier New" w:hAnsi="Courier New" w:cs="Courier New" w:hint="default"/>
+      </w:rPr>
+    </w:lvl>
+    <w:lvl w:ilvl="5" w:tplc="040C0005" w:tentative="1">
+      <w:start w:val="1"/>
+      <w:numFmt w:val="bullet"/>
+      <w:lvlText w:val=""/>
+      <w:lvlJc w:val="left"/>
+      <w:pPr>
+        <w:ind w:left="4680" w:hanging="360"/>
+      </w:pPr>
+      <w:rPr>
+        <w:rFonts w:ascii="Wingdings" w:hAnsi="Wingdings" w:hint="default"/>
+      </w:rPr>
+    </w:lvl>
+    <w:lvl w:ilvl="6" w:tplc="040C0001" w:tentative="1">
+      <w:start w:val="1"/>
+      <w:numFmt w:val="bullet"/>
+      <w:lvlText w:val=""/>
+      <w:lvlJc w:val="left"/>
+      <w:pPr>
+        <w:ind w:left="5400" w:hanging="360"/>
+      </w:pPr>
+      <w:rPr>
+        <w:rFonts w:ascii="Symbol" w:hAnsi="Symbol" w:hint="default"/>
+      </w:rPr>
+    </w:lvl>
+    <w:lvl w:ilvl="7" w:tplc="040C0003" w:tentative="1">
+      <w:start w:val="1"/>
+      <w:numFmt w:val="bullet"/>
+      <w:lvlText w:val="o"/>
+      <w:lvlJc w:val="left"/>
+      <w:pPr>
+        <w:ind w:left="6120" w:hanging="360"/>
+      </w:pPr>
+      <w:rPr>
+        <w:rFonts w:ascii="Courier New" w:hAnsi="Courier New" w:cs="Courier New" w:hint="default"/>
+      </w:rPr>
+    </w:lvl>
+    <w:lvl w:ilvl="8" w:tplc="040C0005" w:tentative="1">
+      <w:start w:val="1"/>
+      <w:numFmt w:val="bullet"/>
+      <w:lvlText w:val=""/>
+      <w:lvlJc w:val="left"/>
+      <w:pPr>
+        <w:ind w:left="6840" w:hanging="360"/>
+      </w:pPr>
+      <w:rPr>
+        <w:rFonts w:ascii="Wingdings" w:hAnsi="Wingdings" w:hint="default"/>
+      </w:rPr>
+    </w:lvl>
+  </w:abstractNum>
+  <w:abstractNum w:abstractNumId="6" w15:restartNumberingAfterBreak="0">
+    <w:nsid w:val="1F0E0844"/>
+    <w:multiLevelType w:val="hybridMultilevel"/>
+    <w:tmpl w:val="4A0AC52A"/>
+    <w:lvl w:ilvl="0" w:tplc="1472B304">
+      <w:start w:val="1"/>
+      <w:numFmt w:val="bullet"/>
+      <w:lvlText w:val="-"/>
+      <w:lvlJc w:val="left"/>
+      <w:pPr>
+        <w:ind w:left="1080" w:hanging="360"/>
+      </w:pPr>
+      <w:rPr>
+        <w:rFonts w:ascii="Times New Roman" w:eastAsia="Times New Roman" w:hAnsi="Times New Roman" w:cs="Times New Roman" w:hint="default"/>
+        <w:b/>
+      </w:rPr>
+    </w:lvl>
+    <w:lvl w:ilvl="1" w:tplc="040C0003" w:tentative="1">
+      <w:start w:val="1"/>
+      <w:numFmt w:val="bullet"/>
+      <w:lvlText w:val="o"/>
+      <w:lvlJc w:val="left"/>
+      <w:pPr>
+        <w:ind w:left="1800" w:hanging="360"/>
+      </w:pPr>
+      <w:rPr>
+        <w:rFonts w:ascii="Courier New" w:hAnsi="Courier New" w:cs="Courier New" w:hint="default"/>
+      </w:rPr>
+    </w:lvl>
+    <w:lvl w:ilvl="2" w:tplc="040C0005" w:tentative="1">
+      <w:start w:val="1"/>
+      <w:numFmt w:val="bullet"/>
+      <w:lvlText w:val=""/>
+      <w:lvlJc w:val="left"/>
+      <w:pPr>
+        <w:ind w:left="2520" w:hanging="360"/>
+      </w:pPr>
+      <w:rPr>
+        <w:rFonts w:ascii="Wingdings" w:hAnsi="Wingdings" w:hint="default"/>
+      </w:rPr>
+    </w:lvl>
+    <w:lvl w:ilvl="3" w:tplc="040C0001" w:tentative="1">
+      <w:start w:val="1"/>
+      <w:numFmt w:val="bullet"/>
+      <w:lvlText w:val=""/>
+      <w:lvlJc w:val="left"/>
+      <w:pPr>
+        <w:ind w:left="3240" w:hanging="360"/>
+      </w:pPr>
+      <w:rPr>
+        <w:rFonts w:ascii="Symbol" w:hAnsi="Symbol" w:hint="default"/>
+      </w:rPr>
+    </w:lvl>
+    <w:lvl w:ilvl="4" w:tplc="040C0003" w:tentative="1">
+      <w:start w:val="1"/>
+      <w:numFmt w:val="bullet"/>
+      <w:lvlText w:val="o"/>
+      <w:lvlJc w:val="left"/>
+      <w:pPr>
+        <w:ind w:left="3960" w:hanging="360"/>
+      </w:pPr>
+      <w:rPr>
+        <w:rFonts w:ascii="Courier New" w:hAnsi="Courier New" w:cs="Courier New" w:hint="default"/>
+      </w:rPr>
+    </w:lvl>
+    <w:lvl w:ilvl="5" w:tplc="040C0005" w:tentative="1">
+      <w:start w:val="1"/>
+      <w:numFmt w:val="bullet"/>
+      <w:lvlText w:val=""/>
+      <w:lvlJc w:val="left"/>
+      <w:pPr>
+        <w:ind w:left="4680" w:hanging="360"/>
+      </w:pPr>
+      <w:rPr>
+        <w:rFonts w:ascii="Wingdings" w:hAnsi="Wingdings" w:hint="default"/>
+      </w:rPr>
+    </w:lvl>
+    <w:lvl w:ilvl="6" w:tplc="040C0001" w:tentative="1">
+      <w:start w:val="1"/>
+      <w:numFmt w:val="bullet"/>
+      <w:lvlText w:val=""/>
+      <w:lvlJc w:val="left"/>
+      <w:pPr>
+        <w:ind w:left="5400" w:hanging="360"/>
+      </w:pPr>
+      <w:rPr>
+        <w:rFonts w:ascii="Symbol" w:hAnsi="Symbol" w:hint="default"/>
+      </w:rPr>
+    </w:lvl>
+    <w:lvl w:ilvl="7" w:tplc="040C0003" w:tentative="1">
+      <w:start w:val="1"/>
+      <w:numFmt w:val="bullet"/>
+      <w:lvlText w:val="o"/>
+      <w:lvlJc w:val="left"/>
+      <w:pPr>
+        <w:ind w:left="6120" w:hanging="360"/>
+      </w:pPr>
+      <w:rPr>
+        <w:rFonts w:ascii="Courier New" w:hAnsi="Courier New" w:cs="Courier New" w:hint="default"/>
+      </w:rPr>
+    </w:lvl>
+    <w:lvl w:ilvl="8" w:tplc="040C0005" w:tentative="1">
+      <w:start w:val="1"/>
+      <w:numFmt w:val="bullet"/>
+      <w:lvlText w:val=""/>
+      <w:lvlJc w:val="left"/>
+      <w:pPr>
+        <w:ind w:left="6840" w:hanging="360"/>
+      </w:pPr>
+      <w:rPr>
+        <w:rFonts w:ascii="Wingdings" w:hAnsi="Wingdings" w:hint="default"/>
+      </w:rPr>
+    </w:lvl>
+  </w:abstractNum>
+  <w:abstractNum w:abstractNumId="7" w15:restartNumberingAfterBreak="0">
     <w:nsid w:val="358C6BF5"/>
     <w:multiLevelType w:val="hybridMultilevel"/>
     <w:tmpl w:val="CEF8A95A"/>
@@ -18676,7 +20269,7 @@
       </w:rPr>
     </w:lvl>
   </w:abstractNum>
-  <w:abstractNum w:abstractNumId="3" w15:restartNumberingAfterBreak="0">
+  <w:abstractNum w:abstractNumId="8" w15:restartNumberingAfterBreak="0">
     <w:nsid w:val="3AEA6D61"/>
     <w:multiLevelType w:val="hybridMultilevel"/>
     <w:tmpl w:val="1B2008DC"/>
@@ -18768,7 +20361,7 @@
       </w:pPr>
     </w:lvl>
   </w:abstractNum>
-  <w:abstractNum w:abstractNumId="4" w15:restartNumberingAfterBreak="0">
+  <w:abstractNum w:abstractNumId="9" w15:restartNumberingAfterBreak="0">
     <w:nsid w:val="3FEC7333"/>
     <w:multiLevelType w:val="hybridMultilevel"/>
     <w:tmpl w:val="7B76E1DE"/>
@@ -18881,7 +20474,210 @@
       </w:rPr>
     </w:lvl>
   </w:abstractNum>
-  <w:abstractNum w:abstractNumId="5" w15:restartNumberingAfterBreak="0">
+  <w:abstractNum w:abstractNumId="10" w15:restartNumberingAfterBreak="0">
+    <w:nsid w:val="42CC5EC8"/>
+    <w:multiLevelType w:val="hybridMultilevel"/>
+    <w:tmpl w:val="16D43050"/>
+    <w:lvl w:ilvl="0" w:tplc="F856A77A">
+      <w:start w:val="1"/>
+      <w:numFmt w:val="decimal"/>
+      <w:lvlText w:val="%1."/>
+      <w:lvlJc w:val="left"/>
+      <w:pPr>
+        <w:ind w:left="1080" w:hanging="360"/>
+      </w:pPr>
+      <w:rPr>
+        <w:rFonts w:asciiTheme="minorHAnsi" w:eastAsiaTheme="minorHAnsi" w:hAnsiTheme="minorHAnsi" w:cstheme="minorBidi"/>
+      </w:rPr>
+    </w:lvl>
+    <w:lvl w:ilvl="1" w:tplc="040C0003" w:tentative="1">
+      <w:start w:val="1"/>
+      <w:numFmt w:val="bullet"/>
+      <w:lvlText w:val="o"/>
+      <w:lvlJc w:val="left"/>
+      <w:pPr>
+        <w:ind w:left="1800" w:hanging="360"/>
+      </w:pPr>
+      <w:rPr>
+        <w:rFonts w:ascii="Courier New" w:hAnsi="Courier New" w:cs="Courier New" w:hint="default"/>
+      </w:rPr>
+    </w:lvl>
+    <w:lvl w:ilvl="2" w:tplc="040C0005" w:tentative="1">
+      <w:start w:val="1"/>
+      <w:numFmt w:val="bullet"/>
+      <w:lvlText w:val=""/>
+      <w:lvlJc w:val="left"/>
+      <w:pPr>
+        <w:ind w:left="2520" w:hanging="360"/>
+      </w:pPr>
+      <w:rPr>
+        <w:rFonts w:ascii="Wingdings" w:hAnsi="Wingdings" w:hint="default"/>
+      </w:rPr>
+    </w:lvl>
+    <w:lvl w:ilvl="3" w:tplc="040C0001" w:tentative="1">
+      <w:start w:val="1"/>
+      <w:numFmt w:val="bullet"/>
+      <w:lvlText w:val=""/>
+      <w:lvlJc w:val="left"/>
+      <w:pPr>
+        <w:ind w:left="3240" w:hanging="360"/>
+      </w:pPr>
+      <w:rPr>
+        <w:rFonts w:ascii="Symbol" w:hAnsi="Symbol" w:hint="default"/>
+      </w:rPr>
+    </w:lvl>
+    <w:lvl w:ilvl="4" w:tplc="040C0003" w:tentative="1">
+      <w:start w:val="1"/>
+      <w:numFmt w:val="bullet"/>
+      <w:lvlText w:val="o"/>
+      <w:lvlJc w:val="left"/>
+      <w:pPr>
+        <w:ind w:left="3960" w:hanging="360"/>
+      </w:pPr>
+      <w:rPr>
+        <w:rFonts w:ascii="Courier New" w:hAnsi="Courier New" w:cs="Courier New" w:hint="default"/>
+      </w:rPr>
+    </w:lvl>
+    <w:lvl w:ilvl="5" w:tplc="040C0005" w:tentative="1">
+      <w:start w:val="1"/>
+      <w:numFmt w:val="bullet"/>
+      <w:lvlText w:val=""/>
+      <w:lvlJc w:val="left"/>
+      <w:pPr>
+        <w:ind w:left="4680" w:hanging="360"/>
+      </w:pPr>
+      <w:rPr>
+        <w:rFonts w:ascii="Wingdings" w:hAnsi="Wingdings" w:hint="default"/>
+      </w:rPr>
+    </w:lvl>
+    <w:lvl w:ilvl="6" w:tplc="040C0001" w:tentative="1">
+      <w:start w:val="1"/>
+      <w:numFmt w:val="bullet"/>
+      <w:lvlText w:val=""/>
+      <w:lvlJc w:val="left"/>
+      <w:pPr>
+        <w:ind w:left="5400" w:hanging="360"/>
+      </w:pPr>
+      <w:rPr>
+        <w:rFonts w:ascii="Symbol" w:hAnsi="Symbol" w:hint="default"/>
+      </w:rPr>
+    </w:lvl>
+    <w:lvl w:ilvl="7" w:tplc="040C0003" w:tentative="1">
+      <w:start w:val="1"/>
+      <w:numFmt w:val="bullet"/>
+      <w:lvlText w:val="o"/>
+      <w:lvlJc w:val="left"/>
+      <w:pPr>
+        <w:ind w:left="6120" w:hanging="360"/>
+      </w:pPr>
+      <w:rPr>
+        <w:rFonts w:ascii="Courier New" w:hAnsi="Courier New" w:cs="Courier New" w:hint="default"/>
+      </w:rPr>
+    </w:lvl>
+    <w:lvl w:ilvl="8" w:tplc="040C0005" w:tentative="1">
+      <w:start w:val="1"/>
+      <w:numFmt w:val="bullet"/>
+      <w:lvlText w:val=""/>
+      <w:lvlJc w:val="left"/>
+      <w:pPr>
+        <w:ind w:left="6840" w:hanging="360"/>
+      </w:pPr>
+      <w:rPr>
+        <w:rFonts w:ascii="Wingdings" w:hAnsi="Wingdings" w:hint="default"/>
+      </w:rPr>
+    </w:lvl>
+  </w:abstractNum>
+  <w:abstractNum w:abstractNumId="11" w15:restartNumberingAfterBreak="0">
+    <w:nsid w:val="49685025"/>
+    <w:multiLevelType w:val="hybridMultilevel"/>
+    <w:tmpl w:val="77C09EA8"/>
+    <w:lvl w:ilvl="0" w:tplc="62108374">
+      <w:start w:val="1"/>
+      <w:numFmt w:val="decimal"/>
+      <w:lvlText w:val="%1."/>
+      <w:lvlJc w:val="left"/>
+      <w:pPr>
+        <w:ind w:left="720" w:hanging="360"/>
+      </w:pPr>
+      <w:rPr>
+        <w:rFonts w:asciiTheme="minorHAnsi" w:eastAsiaTheme="minorHAnsi" w:hAnsiTheme="minorHAnsi" w:cstheme="minorBidi" w:hint="default"/>
+        <w:sz w:val="22"/>
+      </w:rPr>
+    </w:lvl>
+    <w:lvl w:ilvl="1" w:tplc="040C0019" w:tentative="1">
+      <w:start w:val="1"/>
+      <w:numFmt w:val="lowerLetter"/>
+      <w:lvlText w:val="%2."/>
+      <w:lvlJc w:val="left"/>
+      <w:pPr>
+        <w:ind w:left="1440" w:hanging="360"/>
+      </w:pPr>
+    </w:lvl>
+    <w:lvl w:ilvl="2" w:tplc="040C001B" w:tentative="1">
+      <w:start w:val="1"/>
+      <w:numFmt w:val="lowerRoman"/>
+      <w:lvlText w:val="%3."/>
+      <w:lvlJc w:val="right"/>
+      <w:pPr>
+        <w:ind w:left="2160" w:hanging="180"/>
+      </w:pPr>
+    </w:lvl>
+    <w:lvl w:ilvl="3" w:tplc="040C000F" w:tentative="1">
+      <w:start w:val="1"/>
+      <w:numFmt w:val="decimal"/>
+      <w:lvlText w:val="%4."/>
+      <w:lvlJc w:val="left"/>
+      <w:pPr>
+        <w:ind w:left="2880" w:hanging="360"/>
+      </w:pPr>
+    </w:lvl>
+    <w:lvl w:ilvl="4" w:tplc="040C0019" w:tentative="1">
+      <w:start w:val="1"/>
+      <w:numFmt w:val="lowerLetter"/>
+      <w:lvlText w:val="%5."/>
+      <w:lvlJc w:val="left"/>
+      <w:pPr>
+        <w:ind w:left="3600" w:hanging="360"/>
+      </w:pPr>
+    </w:lvl>
+    <w:lvl w:ilvl="5" w:tplc="040C001B" w:tentative="1">
+      <w:start w:val="1"/>
+      <w:numFmt w:val="lowerRoman"/>
+      <w:lvlText w:val="%6."/>
+      <w:lvlJc w:val="right"/>
+      <w:pPr>
+        <w:ind w:left="4320" w:hanging="180"/>
+      </w:pPr>
+    </w:lvl>
+    <w:lvl w:ilvl="6" w:tplc="040C000F" w:tentative="1">
+      <w:start w:val="1"/>
+      <w:numFmt w:val="decimal"/>
+      <w:lvlText w:val="%7."/>
+      <w:lvlJc w:val="left"/>
+      <w:pPr>
+        <w:ind w:left="5040" w:hanging="360"/>
+      </w:pPr>
+    </w:lvl>
+    <w:lvl w:ilvl="7" w:tplc="040C0019" w:tentative="1">
+      <w:start w:val="1"/>
+      <w:numFmt w:val="lowerLetter"/>
+      <w:lvlText w:val="%8."/>
+      <w:lvlJc w:val="left"/>
+      <w:pPr>
+        <w:ind w:left="5760" w:hanging="360"/>
+      </w:pPr>
+    </w:lvl>
+    <w:lvl w:ilvl="8" w:tplc="040C001B" w:tentative="1">
+      <w:start w:val="1"/>
+      <w:numFmt w:val="lowerRoman"/>
+      <w:lvlText w:val="%9."/>
+      <w:lvlJc w:val="right"/>
+      <w:pPr>
+        <w:ind w:left="6480" w:hanging="180"/>
+      </w:pPr>
+    </w:lvl>
+  </w:abstractNum>
+  <w:abstractNum w:abstractNumId="12" w15:restartNumberingAfterBreak="0">
     <w:nsid w:val="5EE94EA4"/>
     <w:multiLevelType w:val="hybridMultilevel"/>
     <w:tmpl w:val="7F5A1540"/>
@@ -18967,7 +20763,394 @@
       </w:pPr>
     </w:lvl>
   </w:abstractNum>
-  <w:abstractNum w:abstractNumId="6" w15:restartNumberingAfterBreak="0">
+  <w:abstractNum w:abstractNumId="13" w15:restartNumberingAfterBreak="0">
+    <w:nsid w:val="60AB5DC5"/>
+    <w:multiLevelType w:val="multilevel"/>
+    <w:tmpl w:val="378E9474"/>
+    <w:lvl w:ilvl="0">
+      <w:start w:val="1"/>
+      <w:numFmt w:val="bullet"/>
+      <w:lvlText w:val=""/>
+      <w:lvlJc w:val="left"/>
+      <w:pPr>
+        <w:tabs>
+          <w:tab w:val="num" w:pos="720"/>
+        </w:tabs>
+        <w:ind w:left="720" w:hanging="360"/>
+      </w:pPr>
+      <w:rPr>
+        <w:rFonts w:ascii="Symbol" w:hAnsi="Symbol" w:hint="default"/>
+        <w:sz w:val="20"/>
+      </w:rPr>
+    </w:lvl>
+    <w:lvl w:ilvl="1" w:tentative="1">
+      <w:start w:val="1"/>
+      <w:numFmt w:val="bullet"/>
+      <w:lvlText w:val="o"/>
+      <w:lvlJc w:val="left"/>
+      <w:pPr>
+        <w:tabs>
+          <w:tab w:val="num" w:pos="1440"/>
+        </w:tabs>
+        <w:ind w:left="1440" w:hanging="360"/>
+      </w:pPr>
+      <w:rPr>
+        <w:rFonts w:ascii="Courier New" w:hAnsi="Courier New" w:hint="default"/>
+        <w:sz w:val="20"/>
+      </w:rPr>
+    </w:lvl>
+    <w:lvl w:ilvl="2" w:tentative="1">
+      <w:start w:val="1"/>
+      <w:numFmt w:val="bullet"/>
+      <w:lvlText w:val=""/>
+      <w:lvlJc w:val="left"/>
+      <w:pPr>
+        <w:tabs>
+          <w:tab w:val="num" w:pos="2160"/>
+        </w:tabs>
+        <w:ind w:left="2160" w:hanging="360"/>
+      </w:pPr>
+      <w:rPr>
+        <w:rFonts w:ascii="Wingdings" w:hAnsi="Wingdings" w:hint="default"/>
+        <w:sz w:val="20"/>
+      </w:rPr>
+    </w:lvl>
+    <w:lvl w:ilvl="3" w:tentative="1">
+      <w:start w:val="1"/>
+      <w:numFmt w:val="bullet"/>
+      <w:lvlText w:val=""/>
+      <w:lvlJc w:val="left"/>
+      <w:pPr>
+        <w:tabs>
+          <w:tab w:val="num" w:pos="2880"/>
+        </w:tabs>
+        <w:ind w:left="2880" w:hanging="360"/>
+      </w:pPr>
+      <w:rPr>
+        <w:rFonts w:ascii="Wingdings" w:hAnsi="Wingdings" w:hint="default"/>
+        <w:sz w:val="20"/>
+      </w:rPr>
+    </w:lvl>
+    <w:lvl w:ilvl="4" w:tentative="1">
+      <w:start w:val="1"/>
+      <w:numFmt w:val="bullet"/>
+      <w:lvlText w:val=""/>
+      <w:lvlJc w:val="left"/>
+      <w:pPr>
+        <w:tabs>
+          <w:tab w:val="num" w:pos="3600"/>
+        </w:tabs>
+        <w:ind w:left="3600" w:hanging="360"/>
+      </w:pPr>
+      <w:rPr>
+        <w:rFonts w:ascii="Wingdings" w:hAnsi="Wingdings" w:hint="default"/>
+        <w:sz w:val="20"/>
+      </w:rPr>
+    </w:lvl>
+    <w:lvl w:ilvl="5" w:tentative="1">
+      <w:start w:val="1"/>
+      <w:numFmt w:val="bullet"/>
+      <w:lvlText w:val=""/>
+      <w:lvlJc w:val="left"/>
+      <w:pPr>
+        <w:tabs>
+          <w:tab w:val="num" w:pos="4320"/>
+        </w:tabs>
+        <w:ind w:left="4320" w:hanging="360"/>
+      </w:pPr>
+      <w:rPr>
+        <w:rFonts w:ascii="Wingdings" w:hAnsi="Wingdings" w:hint="default"/>
+        <w:sz w:val="20"/>
+      </w:rPr>
+    </w:lvl>
+    <w:lvl w:ilvl="6" w:tentative="1">
+      <w:start w:val="1"/>
+      <w:numFmt w:val="bullet"/>
+      <w:lvlText w:val=""/>
+      <w:lvlJc w:val="left"/>
+      <w:pPr>
+        <w:tabs>
+          <w:tab w:val="num" w:pos="5040"/>
+        </w:tabs>
+        <w:ind w:left="5040" w:hanging="360"/>
+      </w:pPr>
+      <w:rPr>
+        <w:rFonts w:ascii="Wingdings" w:hAnsi="Wingdings" w:hint="default"/>
+        <w:sz w:val="20"/>
+      </w:rPr>
+    </w:lvl>
+    <w:lvl w:ilvl="7" w:tentative="1">
+      <w:start w:val="1"/>
+      <w:numFmt w:val="bullet"/>
+      <w:lvlText w:val=""/>
+      <w:lvlJc w:val="left"/>
+      <w:pPr>
+        <w:tabs>
+          <w:tab w:val="num" w:pos="5760"/>
+        </w:tabs>
+        <w:ind w:left="5760" w:hanging="360"/>
+      </w:pPr>
+      <w:rPr>
+        <w:rFonts w:ascii="Wingdings" w:hAnsi="Wingdings" w:hint="default"/>
+        <w:sz w:val="20"/>
+      </w:rPr>
+    </w:lvl>
+    <w:lvl w:ilvl="8" w:tentative="1">
+      <w:start w:val="1"/>
+      <w:numFmt w:val="bullet"/>
+      <w:lvlText w:val=""/>
+      <w:lvlJc w:val="left"/>
+      <w:pPr>
+        <w:tabs>
+          <w:tab w:val="num" w:pos="6480"/>
+        </w:tabs>
+        <w:ind w:left="6480" w:hanging="360"/>
+      </w:pPr>
+      <w:rPr>
+        <w:rFonts w:ascii="Wingdings" w:hAnsi="Wingdings" w:hint="default"/>
+        <w:sz w:val="20"/>
+      </w:rPr>
+    </w:lvl>
+  </w:abstractNum>
+  <w:abstractNum w:abstractNumId="14" w15:restartNumberingAfterBreak="0">
+    <w:nsid w:val="61E144C0"/>
+    <w:multiLevelType w:val="hybridMultilevel"/>
+    <w:tmpl w:val="4D401A1E"/>
+    <w:lvl w:ilvl="0" w:tplc="5914B5F6">
+      <w:start w:val="1"/>
+      <w:numFmt w:val="decimal"/>
+      <w:lvlText w:val="%1."/>
+      <w:lvlJc w:val="left"/>
+      <w:pPr>
+        <w:ind w:left="720" w:hanging="360"/>
+      </w:pPr>
+      <w:rPr>
+        <w:rFonts w:hAnsi="Symbol" w:hint="default"/>
+      </w:rPr>
+    </w:lvl>
+    <w:lvl w:ilvl="1" w:tplc="040C0019" w:tentative="1">
+      <w:start w:val="1"/>
+      <w:numFmt w:val="lowerLetter"/>
+      <w:lvlText w:val="%2."/>
+      <w:lvlJc w:val="left"/>
+      <w:pPr>
+        <w:ind w:left="1440" w:hanging="360"/>
+      </w:pPr>
+    </w:lvl>
+    <w:lvl w:ilvl="2" w:tplc="040C001B" w:tentative="1">
+      <w:start w:val="1"/>
+      <w:numFmt w:val="lowerRoman"/>
+      <w:lvlText w:val="%3."/>
+      <w:lvlJc w:val="right"/>
+      <w:pPr>
+        <w:ind w:left="2160" w:hanging="180"/>
+      </w:pPr>
+    </w:lvl>
+    <w:lvl w:ilvl="3" w:tplc="040C000F" w:tentative="1">
+      <w:start w:val="1"/>
+      <w:numFmt w:val="decimal"/>
+      <w:lvlText w:val="%4."/>
+      <w:lvlJc w:val="left"/>
+      <w:pPr>
+        <w:ind w:left="2880" w:hanging="360"/>
+      </w:pPr>
+    </w:lvl>
+    <w:lvl w:ilvl="4" w:tplc="040C0019" w:tentative="1">
+      <w:start w:val="1"/>
+      <w:numFmt w:val="lowerLetter"/>
+      <w:lvlText w:val="%5."/>
+      <w:lvlJc w:val="left"/>
+      <w:pPr>
+        <w:ind w:left="3600" w:hanging="360"/>
+      </w:pPr>
+    </w:lvl>
+    <w:lvl w:ilvl="5" w:tplc="040C001B" w:tentative="1">
+      <w:start w:val="1"/>
+      <w:numFmt w:val="lowerRoman"/>
+      <w:lvlText w:val="%6."/>
+      <w:lvlJc w:val="right"/>
+      <w:pPr>
+        <w:ind w:left="4320" w:hanging="180"/>
+      </w:pPr>
+    </w:lvl>
+    <w:lvl w:ilvl="6" w:tplc="040C000F" w:tentative="1">
+      <w:start w:val="1"/>
+      <w:numFmt w:val="decimal"/>
+      <w:lvlText w:val="%7."/>
+      <w:lvlJc w:val="left"/>
+      <w:pPr>
+        <w:ind w:left="5040" w:hanging="360"/>
+      </w:pPr>
+    </w:lvl>
+    <w:lvl w:ilvl="7" w:tplc="040C0019" w:tentative="1">
+      <w:start w:val="1"/>
+      <w:numFmt w:val="lowerLetter"/>
+      <w:lvlText w:val="%8."/>
+      <w:lvlJc w:val="left"/>
+      <w:pPr>
+        <w:ind w:left="5760" w:hanging="360"/>
+      </w:pPr>
+    </w:lvl>
+    <w:lvl w:ilvl="8" w:tplc="040C001B" w:tentative="1">
+      <w:start w:val="1"/>
+      <w:numFmt w:val="lowerRoman"/>
+      <w:lvlText w:val="%9."/>
+      <w:lvlJc w:val="right"/>
+      <w:pPr>
+        <w:ind w:left="6480" w:hanging="180"/>
+      </w:pPr>
+    </w:lvl>
+  </w:abstractNum>
+  <w:abstractNum w:abstractNumId="15" w15:restartNumberingAfterBreak="0">
+    <w:nsid w:val="657B7C1F"/>
+    <w:multiLevelType w:val="multilevel"/>
+    <w:tmpl w:val="2EF0F9FC"/>
+    <w:lvl w:ilvl="0">
+      <w:start w:val="1"/>
+      <w:numFmt w:val="bullet"/>
+      <w:lvlText w:val=""/>
+      <w:lvlJc w:val="left"/>
+      <w:pPr>
+        <w:tabs>
+          <w:tab w:val="num" w:pos="720"/>
+        </w:tabs>
+        <w:ind w:left="720" w:hanging="360"/>
+      </w:pPr>
+      <w:rPr>
+        <w:rFonts w:ascii="Symbol" w:hAnsi="Symbol" w:hint="default"/>
+        <w:sz w:val="20"/>
+      </w:rPr>
+    </w:lvl>
+    <w:lvl w:ilvl="1" w:tentative="1">
+      <w:start w:val="1"/>
+      <w:numFmt w:val="bullet"/>
+      <w:lvlText w:val="o"/>
+      <w:lvlJc w:val="left"/>
+      <w:pPr>
+        <w:tabs>
+          <w:tab w:val="num" w:pos="1440"/>
+        </w:tabs>
+        <w:ind w:left="1440" w:hanging="360"/>
+      </w:pPr>
+      <w:rPr>
+        <w:rFonts w:ascii="Courier New" w:hAnsi="Courier New" w:hint="default"/>
+        <w:sz w:val="20"/>
+      </w:rPr>
+    </w:lvl>
+    <w:lvl w:ilvl="2" w:tentative="1">
+      <w:start w:val="1"/>
+      <w:numFmt w:val="bullet"/>
+      <w:lvlText w:val=""/>
+      <w:lvlJc w:val="left"/>
+      <w:pPr>
+        <w:tabs>
+          <w:tab w:val="num" w:pos="2160"/>
+        </w:tabs>
+        <w:ind w:left="2160" w:hanging="360"/>
+      </w:pPr>
+      <w:rPr>
+        <w:rFonts w:ascii="Wingdings" w:hAnsi="Wingdings" w:hint="default"/>
+        <w:sz w:val="20"/>
+      </w:rPr>
+    </w:lvl>
+    <w:lvl w:ilvl="3" w:tentative="1">
+      <w:start w:val="1"/>
+      <w:numFmt w:val="bullet"/>
+      <w:lvlText w:val=""/>
+      <w:lvlJc w:val="left"/>
+      <w:pPr>
+        <w:tabs>
+          <w:tab w:val="num" w:pos="2880"/>
+        </w:tabs>
+        <w:ind w:left="2880" w:hanging="360"/>
+      </w:pPr>
+      <w:rPr>
+        <w:rFonts w:ascii="Wingdings" w:hAnsi="Wingdings" w:hint="default"/>
+        <w:sz w:val="20"/>
+      </w:rPr>
+    </w:lvl>
+    <w:lvl w:ilvl="4" w:tentative="1">
+      <w:start w:val="1"/>
+      <w:numFmt w:val="bullet"/>
+      <w:lvlText w:val=""/>
+      <w:lvlJc w:val="left"/>
+      <w:pPr>
+        <w:tabs>
+          <w:tab w:val="num" w:pos="3600"/>
+        </w:tabs>
+        <w:ind w:left="3600" w:hanging="360"/>
+      </w:pPr>
+      <w:rPr>
+        <w:rFonts w:ascii="Wingdings" w:hAnsi="Wingdings" w:hint="default"/>
+        <w:sz w:val="20"/>
+      </w:rPr>
+    </w:lvl>
+    <w:lvl w:ilvl="5" w:tentative="1">
+      <w:start w:val="1"/>
+      <w:numFmt w:val="bullet"/>
+      <w:lvlText w:val=""/>
+      <w:lvlJc w:val="left"/>
+      <w:pPr>
+        <w:tabs>
+          <w:tab w:val="num" w:pos="4320"/>
+        </w:tabs>
+        <w:ind w:left="4320" w:hanging="360"/>
+      </w:pPr>
+      <w:rPr>
+        <w:rFonts w:ascii="Wingdings" w:hAnsi="Wingdings" w:hint="default"/>
+        <w:sz w:val="20"/>
+      </w:rPr>
+    </w:lvl>
+    <w:lvl w:ilvl="6" w:tentative="1">
+      <w:start w:val="1"/>
+      <w:numFmt w:val="bullet"/>
+      <w:lvlText w:val=""/>
+      <w:lvlJc w:val="left"/>
+      <w:pPr>
+        <w:tabs>
+          <w:tab w:val="num" w:pos="5040"/>
+        </w:tabs>
+        <w:ind w:left="5040" w:hanging="360"/>
+      </w:pPr>
+      <w:rPr>
+        <w:rFonts w:ascii="Wingdings" w:hAnsi="Wingdings" w:hint="default"/>
+        <w:sz w:val="20"/>
+      </w:rPr>
+    </w:lvl>
+    <w:lvl w:ilvl="7" w:tentative="1">
+      <w:start w:val="1"/>
+      <w:numFmt w:val="bullet"/>
+      <w:lvlText w:val=""/>
+      <w:lvlJc w:val="left"/>
+      <w:pPr>
+        <w:tabs>
+          <w:tab w:val="num" w:pos="5760"/>
+        </w:tabs>
+        <w:ind w:left="5760" w:hanging="360"/>
+      </w:pPr>
+      <w:rPr>
+        <w:rFonts w:ascii="Wingdings" w:hAnsi="Wingdings" w:hint="default"/>
+        <w:sz w:val="20"/>
+      </w:rPr>
+    </w:lvl>
+    <w:lvl w:ilvl="8" w:tentative="1">
+      <w:start w:val="1"/>
+      <w:numFmt w:val="bullet"/>
+      <w:lvlText w:val=""/>
+      <w:lvlJc w:val="left"/>
+      <w:pPr>
+        <w:tabs>
+          <w:tab w:val="num" w:pos="6480"/>
+        </w:tabs>
+        <w:ind w:left="6480" w:hanging="360"/>
+      </w:pPr>
+      <w:rPr>
+        <w:rFonts w:ascii="Wingdings" w:hAnsi="Wingdings" w:hint="default"/>
+        <w:sz w:val="20"/>
+      </w:rPr>
+    </w:lvl>
+  </w:abstractNum>
+  <w:abstractNum w:abstractNumId="16" w15:restartNumberingAfterBreak="0">
     <w:nsid w:val="67237FEF"/>
     <w:multiLevelType w:val="hybridMultilevel"/>
     <w:tmpl w:val="B3263298"/>
@@ -19081,25 +21264,207 @@
       </w:rPr>
     </w:lvl>
   </w:abstractNum>
+  <w:abstractNum w:abstractNumId="17" w15:restartNumberingAfterBreak="0">
+    <w:nsid w:val="780F2DF3"/>
+    <w:multiLevelType w:val="multilevel"/>
+    <w:tmpl w:val="DFF8D7E6"/>
+    <w:lvl w:ilvl="0">
+      <w:start w:val="1"/>
+      <w:numFmt w:val="bullet"/>
+      <w:lvlText w:val=""/>
+      <w:lvlJc w:val="left"/>
+      <w:pPr>
+        <w:tabs>
+          <w:tab w:val="num" w:pos="720"/>
+        </w:tabs>
+        <w:ind w:left="720" w:hanging="360"/>
+      </w:pPr>
+      <w:rPr>
+        <w:rFonts w:ascii="Symbol" w:hAnsi="Symbol" w:hint="default"/>
+        <w:sz w:val="20"/>
+      </w:rPr>
+    </w:lvl>
+    <w:lvl w:ilvl="1" w:tentative="1">
+      <w:start w:val="1"/>
+      <w:numFmt w:val="bullet"/>
+      <w:lvlText w:val="o"/>
+      <w:lvlJc w:val="left"/>
+      <w:pPr>
+        <w:tabs>
+          <w:tab w:val="num" w:pos="1440"/>
+        </w:tabs>
+        <w:ind w:left="1440" w:hanging="360"/>
+      </w:pPr>
+      <w:rPr>
+        <w:rFonts w:ascii="Courier New" w:hAnsi="Courier New" w:hint="default"/>
+        <w:sz w:val="20"/>
+      </w:rPr>
+    </w:lvl>
+    <w:lvl w:ilvl="2" w:tentative="1">
+      <w:start w:val="1"/>
+      <w:numFmt w:val="bullet"/>
+      <w:lvlText w:val=""/>
+      <w:lvlJc w:val="left"/>
+      <w:pPr>
+        <w:tabs>
+          <w:tab w:val="num" w:pos="2160"/>
+        </w:tabs>
+        <w:ind w:left="2160" w:hanging="360"/>
+      </w:pPr>
+      <w:rPr>
+        <w:rFonts w:ascii="Wingdings" w:hAnsi="Wingdings" w:hint="default"/>
+        <w:sz w:val="20"/>
+      </w:rPr>
+    </w:lvl>
+    <w:lvl w:ilvl="3" w:tentative="1">
+      <w:start w:val="1"/>
+      <w:numFmt w:val="bullet"/>
+      <w:lvlText w:val=""/>
+      <w:lvlJc w:val="left"/>
+      <w:pPr>
+        <w:tabs>
+          <w:tab w:val="num" w:pos="2880"/>
+        </w:tabs>
+        <w:ind w:left="2880" w:hanging="360"/>
+      </w:pPr>
+      <w:rPr>
+        <w:rFonts w:ascii="Wingdings" w:hAnsi="Wingdings" w:hint="default"/>
+        <w:sz w:val="20"/>
+      </w:rPr>
+    </w:lvl>
+    <w:lvl w:ilvl="4" w:tentative="1">
+      <w:start w:val="1"/>
+      <w:numFmt w:val="bullet"/>
+      <w:lvlText w:val=""/>
+      <w:lvlJc w:val="left"/>
+      <w:pPr>
+        <w:tabs>
+          <w:tab w:val="num" w:pos="3600"/>
+        </w:tabs>
+        <w:ind w:left="3600" w:hanging="360"/>
+      </w:pPr>
+      <w:rPr>
+        <w:rFonts w:ascii="Wingdings" w:hAnsi="Wingdings" w:hint="default"/>
+        <w:sz w:val="20"/>
+      </w:rPr>
+    </w:lvl>
+    <w:lvl w:ilvl="5" w:tentative="1">
+      <w:start w:val="1"/>
+      <w:numFmt w:val="bullet"/>
+      <w:lvlText w:val=""/>
+      <w:lvlJc w:val="left"/>
+      <w:pPr>
+        <w:tabs>
+          <w:tab w:val="num" w:pos="4320"/>
+        </w:tabs>
+        <w:ind w:left="4320" w:hanging="360"/>
+      </w:pPr>
+      <w:rPr>
+        <w:rFonts w:ascii="Wingdings" w:hAnsi="Wingdings" w:hint="default"/>
+        <w:sz w:val="20"/>
+      </w:rPr>
+    </w:lvl>
+    <w:lvl w:ilvl="6" w:tentative="1">
+      <w:start w:val="1"/>
+      <w:numFmt w:val="bullet"/>
+      <w:lvlText w:val=""/>
+      <w:lvlJc w:val="left"/>
+      <w:pPr>
+        <w:tabs>
+          <w:tab w:val="num" w:pos="5040"/>
+        </w:tabs>
+        <w:ind w:left="5040" w:hanging="360"/>
+      </w:pPr>
+      <w:rPr>
+        <w:rFonts w:ascii="Wingdings" w:hAnsi="Wingdings" w:hint="default"/>
+        <w:sz w:val="20"/>
+      </w:rPr>
+    </w:lvl>
+    <w:lvl w:ilvl="7" w:tentative="1">
+      <w:start w:val="1"/>
+      <w:numFmt w:val="bullet"/>
+      <w:lvlText w:val=""/>
+      <w:lvlJc w:val="left"/>
+      <w:pPr>
+        <w:tabs>
+          <w:tab w:val="num" w:pos="5760"/>
+        </w:tabs>
+        <w:ind w:left="5760" w:hanging="360"/>
+      </w:pPr>
+      <w:rPr>
+        <w:rFonts w:ascii="Wingdings" w:hAnsi="Wingdings" w:hint="default"/>
+        <w:sz w:val="20"/>
+      </w:rPr>
+    </w:lvl>
+    <w:lvl w:ilvl="8" w:tentative="1">
+      <w:start w:val="1"/>
+      <w:numFmt w:val="bullet"/>
+      <w:lvlText w:val=""/>
+      <w:lvlJc w:val="left"/>
+      <w:pPr>
+        <w:tabs>
+          <w:tab w:val="num" w:pos="6480"/>
+        </w:tabs>
+        <w:ind w:left="6480" w:hanging="360"/>
+      </w:pPr>
+      <w:rPr>
+        <w:rFonts w:ascii="Wingdings" w:hAnsi="Wingdings" w:hint="default"/>
+        <w:sz w:val="20"/>
+      </w:rPr>
+    </w:lvl>
+  </w:abstractNum>
   <w:num w:numId="1">
-    <w:abstractNumId w:val="4"/>
+    <w:abstractNumId w:val="9"/>
   </w:num>
   <w:num w:numId="2">
-    <w:abstractNumId w:val="1"/>
+    <w:abstractNumId w:val="4"/>
   </w:num>
   <w:num w:numId="3">
     <w:abstractNumId w:val="0"/>
   </w:num>
   <w:num w:numId="4">
+    <w:abstractNumId w:val="16"/>
+  </w:num>
+  <w:num w:numId="5">
+    <w:abstractNumId w:val="7"/>
+  </w:num>
+  <w:num w:numId="6">
+    <w:abstractNumId w:val="12"/>
+  </w:num>
+  <w:num w:numId="7">
+    <w:abstractNumId w:val="8"/>
+  </w:num>
+  <w:num w:numId="8">
+    <w:abstractNumId w:val="1"/>
+  </w:num>
+  <w:num w:numId="9">
+    <w:abstractNumId w:val="17"/>
+  </w:num>
+  <w:num w:numId="10">
+    <w:abstractNumId w:val="2"/>
+  </w:num>
+  <w:num w:numId="11">
+    <w:abstractNumId w:val="15"/>
+  </w:num>
+  <w:num w:numId="12">
+    <w:abstractNumId w:val="13"/>
+  </w:num>
+  <w:num w:numId="13">
+    <w:abstractNumId w:val="14"/>
+  </w:num>
+  <w:num w:numId="14">
     <w:abstractNumId w:val="6"/>
   </w:num>
-  <w:num w:numId="5">
-    <w:abstractNumId w:val="2"/>
+  <w:num w:numId="15">
+    <w:abstractNumId w:val="10"/>
   </w:num>
-  <w:num w:numId="6">
+  <w:num w:numId="16">
     <w:abstractNumId w:val="5"/>
   </w:num>
-  <w:num w:numId="7">
+  <w:num w:numId="17">
+    <w:abstractNumId w:val="11"/>
+  </w:num>
+  <w:num w:numId="18">
     <w:abstractNumId w:val="3"/>
   </w:num>
 </w:numbering>
@@ -19723,6 +22088,44 @@
       <w:rFonts w:ascii="Calibri" w:hAnsi="Calibri"/>
       <w:color w:val="404040" w:themeColor="text1" w:themeTint="BF"/>
       <w:u w:val="none"/>
+    </w:rPr>
+  </w:style>
+  <w:style w:type="paragraph" w:styleId="NormalWeb">
+    <w:name w:val="Normal (Web)"/>
+    <w:basedOn w:val="Normal"/>
+    <w:uiPriority w:val="99"/>
+    <w:unhideWhenUsed/>
+    <w:rsid w:val="004D1596"/>
+    <w:pPr>
+      <w:spacing w:before="100" w:beforeAutospacing="1" w:after="100" w:afterAutospacing="1" w:line="240" w:lineRule="auto"/>
+    </w:pPr>
+    <w:rPr>
+      <w:rFonts w:ascii="Times New Roman" w:eastAsia="Times New Roman" w:hAnsi="Times New Roman" w:cs="Times New Roman"/>
+      <w:sz w:val="24"/>
+      <w:szCs w:val="24"/>
+      <w:lang w:eastAsia="fr-FR"/>
+    </w:rPr>
+  </w:style>
+  <w:style w:type="character" w:styleId="lev">
+    <w:name w:val="Strong"/>
+    <w:basedOn w:val="Policepardfaut"/>
+    <w:uiPriority w:val="22"/>
+    <w:qFormat/>
+    <w:rsid w:val="004D1596"/>
+    <w:rPr>
+      <w:b/>
+      <w:bCs/>
+    </w:rPr>
+  </w:style>
+  <w:style w:type="character" w:styleId="Accentuation">
+    <w:name w:val="Emphasis"/>
+    <w:basedOn w:val="Policepardfaut"/>
+    <w:uiPriority w:val="20"/>
+    <w:qFormat/>
+    <w:rsid w:val="004D1596"/>
+    <w:rPr>
+      <w:i/>
+      <w:iCs/>
     </w:rPr>
   </w:style>
 </w:styles>
@@ -22025,37 +24428,6 @@
     </w:docPart>
     <w:docPart>
       <w:docPartPr>
-        <w:name w:val="C824B0BB85C9473F9A8165AF3FD67089"/>
-        <w:category>
-          <w:name w:val="Général"/>
-          <w:gallery w:val="placeholder"/>
-        </w:category>
-        <w:types>
-          <w:type w:val="bbPlcHdr"/>
-        </w:types>
-        <w:behaviors>
-          <w:behavior w:val="content"/>
-        </w:behaviors>
-        <w:guid w:val="{99C590AA-2763-48E1-99AE-D8E6F74472B2}"/>
-      </w:docPartPr>
-      <w:docPartBody>
-        <w:p>
-          <w:pPr>
-            <w:pStyle w:val="C824B0BB85C9473F9A8165AF3FD67089"/>
-          </w:pPr>
-          <w:r>
-            <w:rPr>
-              <w:rStyle w:val="Textedelespacerserv"/>
-              <w:sz w:val="20"/>
-              <w:szCs w:val="20"/>
-            </w:rPr>
-            <w:t>Cliquez ici pour taper du texte.</w:t>
-          </w:r>
-        </w:p>
-      </w:docPartBody>
-    </w:docPart>
-    <w:docPart>
-      <w:docPartPr>
         <w:name w:val="F7EDF6C6102344B698D66D7708E3923A"/>
         <w:category>
           <w:name w:val="Général"/>
@@ -22604,6 +24976,35 @@
         </w:p>
       </w:docPartBody>
     </w:docPart>
+    <w:docPart>
+      <w:docPartPr>
+        <w:name w:val="7583E23F15194DFBABD56FE9E71B614C"/>
+        <w:category>
+          <w:name w:val="Général"/>
+          <w:gallery w:val="placeholder"/>
+        </w:category>
+        <w:types>
+          <w:type w:val="bbPlcHdr"/>
+        </w:types>
+        <w:behaviors>
+          <w:behavior w:val="content"/>
+        </w:behaviors>
+        <w:guid w:val="{2D90F179-7ED3-4CF1-AE57-6DC47DDA23F3}"/>
+      </w:docPartPr>
+      <w:docPartBody>
+        <w:p>
+          <w:pPr>
+            <w:pStyle w:val="7583E23F15194DFBABD56FE9E71B614C"/>
+          </w:pPr>
+          <w:r>
+            <w:rPr>
+              <w:rStyle w:val="Textedelespacerserv"/>
+            </w:rPr>
+            <w:t>Cliquez ici pour taper du texte.</w:t>
+          </w:r>
+        </w:p>
+      </w:docPartBody>
+    </w:docPart>
   </w:docParts>
 </w:glossaryDocument>
 </file>
@@ -22710,6 +25111,7 @@
     <w:rsidRoot w:val="00E80FF6"/>
     <w:rsid w:val="000654E0"/>
     <w:rsid w:val="001D40C9"/>
+    <w:rsid w:val="00312F65"/>
     <w:rsid w:val="003469F1"/>
     <w:rsid w:val="003879CC"/>
     <w:rsid w:val="004A531E"/>
@@ -22725,6 +25127,7 @@
     <w:rsid w:val="00B92A5D"/>
     <w:rsid w:val="00E42D0A"/>
     <w:rsid w:val="00E80FF6"/>
+    <w:rsid w:val="00EF310E"/>
     <w:rsid w:val="00F555D9"/>
     <w:rsid w:val="00FF73A7"/>
   </w:rsids>
@@ -23179,7 +25582,7 @@
     <w:basedOn w:val="Policepardfaut"/>
     <w:uiPriority w:val="99"/>
     <w:semiHidden/>
-    <w:rsid w:val="00797943"/>
+    <w:rsid w:val="00EF310E"/>
     <w:rPr>
       <w:color w:val="808080"/>
     </w:rPr>
@@ -23917,6 +26320,13 @@
       <w:spacing w:after="160" w:line="259" w:lineRule="auto"/>
     </w:pPr>
   </w:style>
+  <w:style w:type="paragraph" w:customStyle="1" w:styleId="7583E23F15194DFBABD56FE9E71B614C">
+    <w:name w:val="7583E23F15194DFBABD56FE9E71B614C"/>
+    <w:rsid w:val="00EF310E"/>
+    <w:pPr>
+      <w:spacing w:after="160" w:line="259" w:lineRule="auto"/>
+    </w:pPr>
+  </w:style>
 </w:styles>
 </file>
 
@@ -24213,10 +26623,6 @@
 </file>
 
 <file path=customXml/item1.xml><?xml version="1.0" encoding="utf-8"?>
-<b:Sources xmlns:b="http://schemas.openxmlformats.org/officeDocument/2006/bibliography" xmlns="http://schemas.openxmlformats.org/officeDocument/2006/bibliography" SelectedStyle="\APA.XSL" StyleName="APA"/>
-</file>
-
-<file path=customXml/item2.xml><?xml version="1.0" encoding="utf-8"?>
 <p:properties xmlns:p="http://schemas.microsoft.com/office/2006/metadata/properties" xmlns:xsi="http://www.w3.org/2001/XMLSchema-instance" xmlns:pc="http://schemas.microsoft.com/office/infopath/2007/PartnerControls">
   <documentManagement>
     <SharedWithUsers xmlns="37bc8780-cabb-421b-a9ea-c26ab8f28d68">
@@ -24234,7 +26640,20 @@
 </p:properties>
 </file>
 
+<file path=customXml/item2.xml><?xml version="1.0" encoding="utf-8"?>
+<b:Sources xmlns:b="http://schemas.openxmlformats.org/officeDocument/2006/bibliography" xmlns="http://schemas.openxmlformats.org/officeDocument/2006/bibliography" SelectedStyle="\APA.XSL" StyleName="APA"/>
+</file>
+
 <file path=customXml/item3.xml><?xml version="1.0" encoding="utf-8"?>
+<?mso-contentType ?>
+<FormTemplates xmlns="http://schemas.microsoft.com/sharepoint/v3/contenttype/forms">
+  <Display>DocumentLibraryForm</Display>
+  <Edit>DocumentLibraryForm</Edit>
+  <New>DocumentLibraryForm</New>
+</FormTemplates>
+</file>
+
+<file path=customXml/item4.xml><?xml version="1.0" encoding="utf-8"?>
 <ct:contentTypeSchema xmlns:ct="http://schemas.microsoft.com/office/2006/metadata/contentType" xmlns:ma="http://schemas.microsoft.com/office/2006/metadata/properties/metaAttributes" ct:_="" ma:_="" ma:contentTypeName="Document" ma:contentTypeID="0x010100D7B32A49BAB6634ABED4D722E2F22DCD" ma:contentTypeVersion="16" ma:contentTypeDescription="Crée un document." ma:contentTypeScope="" ma:versionID="c546e2b491a00149054e85f050952f24">
   <xsd:schema xmlns:xsd="http://www.w3.org/2001/XMLSchema" xmlns:xs="http://www.w3.org/2001/XMLSchema" xmlns:p="http://schemas.microsoft.com/office/2006/metadata/properties" xmlns:ns2="a277d680-099b-4a9d-8a0b-d0a0b2e1b1a9" xmlns:ns3="37bc8780-cabb-421b-a9ea-c26ab8f28d68" targetNamespace="http://schemas.microsoft.com/office/2006/metadata/properties" ma:root="true" ma:fieldsID="f7f4f02602ff7754e820f628ed769cf5" ns2:_="" ns3:_="">
     <xsd:import namespace="a277d680-099b-4a9d-8a0b-d0a0b2e1b1a9"/>
@@ -24477,24 +26896,7 @@
 </ct:contentTypeSchema>
 </file>
 
-<file path=customXml/item4.xml><?xml version="1.0" encoding="utf-8"?>
-<?mso-contentType ?>
-<FormTemplates xmlns="http://schemas.microsoft.com/sharepoint/v3/contenttype/forms">
-  <Display>DocumentLibraryForm</Display>
-  <Edit>DocumentLibraryForm</Edit>
-  <New>DocumentLibraryForm</New>
-</FormTemplates>
-</file>
-
 <file path=customXml/itemProps1.xml><?xml version="1.0" encoding="utf-8"?>
-<ds:datastoreItem xmlns:ds="http://schemas.openxmlformats.org/officeDocument/2006/customXml" ds:itemID="{7C70DC0C-DB8D-4D29-A040-F94C1AD056E8}">
-  <ds:schemaRefs>
-    <ds:schemaRef ds:uri="http://schemas.openxmlformats.org/officeDocument/2006/bibliography"/>
-  </ds:schemaRefs>
-</ds:datastoreItem>
-</file>
-
-<file path=customXml/itemProps2.xml><?xml version="1.0" encoding="utf-8"?>
 <ds:datastoreItem xmlns:ds="http://schemas.openxmlformats.org/officeDocument/2006/customXml" ds:itemID="{4F23BC8E-CE46-441F-AA55-F9EA17344E42}">
   <ds:schemaRefs>
     <ds:schemaRef ds:uri="http://schemas.microsoft.com/office/2006/metadata/properties"/>
@@ -24505,7 +26907,23 @@
 </ds:datastoreItem>
 </file>
 
+<file path=customXml/itemProps2.xml><?xml version="1.0" encoding="utf-8"?>
+<ds:datastoreItem xmlns:ds="http://schemas.openxmlformats.org/officeDocument/2006/customXml" ds:itemID="{7C70DC0C-DB8D-4D29-A040-F94C1AD056E8}">
+  <ds:schemaRefs>
+    <ds:schemaRef ds:uri="http://schemas.openxmlformats.org/officeDocument/2006/bibliography"/>
+  </ds:schemaRefs>
+</ds:datastoreItem>
+</file>
+
 <file path=customXml/itemProps3.xml><?xml version="1.0" encoding="utf-8"?>
+<ds:datastoreItem xmlns:ds="http://schemas.openxmlformats.org/officeDocument/2006/customXml" ds:itemID="{88ECD17B-078E-489C-9C0D-0D17C7CAFB54}">
+  <ds:schemaRefs>
+    <ds:schemaRef ds:uri="http://schemas.microsoft.com/sharepoint/v3/contenttype/forms"/>
+  </ds:schemaRefs>
+</ds:datastoreItem>
+</file>
+
+<file path=customXml/itemProps4.xml><?xml version="1.0" encoding="utf-8"?>
 <ds:datastoreItem xmlns:ds="http://schemas.openxmlformats.org/officeDocument/2006/customXml" ds:itemID="{03702071-5395-4FF8-9479-69AE28E9BD17}">
   <ds:schemaRefs>
     <ds:schemaRef ds:uri="http://schemas.microsoft.com/office/2006/metadata/contentType"/>
@@ -24522,12 +26940,4 @@
     <ds:schemaRef ds:uri="http://schemas.microsoft.com/internal/obd"/>
   </ds:schemaRefs>
 </ds:datastoreItem>
-</file>
-
-<file path=customXml/itemProps4.xml><?xml version="1.0" encoding="utf-8"?>
-<ds:datastoreItem xmlns:ds="http://schemas.openxmlformats.org/officeDocument/2006/customXml" ds:itemID="{88ECD17B-078E-489C-9C0D-0D17C7CAFB54}">
-  <ds:schemaRefs>
-    <ds:schemaRef ds:uri="http://schemas.microsoft.com/sharepoint/v3/contenttype/forms"/>
-  </ds:schemaRefs>
-</ds:datastoreItem>
 </file>
</xml_diff>